<commit_message>
update 2_4 & report
</commit_message>
<xml_diff>
--- a/Lab_2/Mirgaliev_2.docx
+++ b/Lab_2/Mirgaliev_2.docx
@@ -3951,7 +3951,7 @@
           <mc:Choice Requires="wpg">
             <w:drawing>
               <wp:inline xmlns:wp="http://schemas.openxmlformats.org/drawingml/2006/wordprocessingDrawing" distT="0" distB="0" distL="0" distR="0">
-                <wp:extent cx="5535531" cy="4471006"/>
+                <wp:extent cx="5916532" cy="4778737"/>
                 <wp:effectExtent l="0" t="0" r="0" b="0"/>
                 <wp:docPr id="2" name=""/>
                 <wp:cNvGraphicFramePr>
@@ -3974,7 +3974,7 @@
                       <pic:spPr bwMode="auto">
                         <a:xfrm flipH="0" flipV="0">
                           <a:off x="0" y="0"/>
-                          <a:ext cx="5535531" cy="4471006"/>
+                          <a:ext cx="5916531" cy="4778737"/>
                         </a:xfrm>
                         <a:prstGeom prst="rect">
                           <a:avLst/>
@@ -4007,7 +4007,7 @@
                 <v:path o:extrusionok="f" gradientshapeok="t" o:connecttype="rect"/>
                 <o:lock v:ext="edit" aspectratio="t"/>
               </v:shapetype>
-              <v:shape id="_x0000_i1" o:spid="_x0000_s1" type="#_x0000_t75" style="width:435.87pt;height:352.05pt;mso-wrap-distance-left:0.00pt;mso-wrap-distance-top:0.00pt;mso-wrap-distance-right:0.00pt;mso-wrap-distance-bottom:0.00pt;z-index:1;" stroked="false">
+              <v:shape id="_x0000_i1" o:spid="_x0000_s1" type="#_x0000_t75" style="width:465.87pt;height:376.28pt;mso-wrap-distance-left:0.00pt;mso-wrap-distance-top:0.00pt;mso-wrap-distance-right:0.00pt;mso-wrap-distance-bottom:0.00pt;z-index:1;" stroked="false">
                 <v:imagedata r:id="rId13" o:title=""/>
                 <o:lock v:ext="edit" rotation="t"/>
               </v:shape>
@@ -4020,6 +4020,44 @@
           <w:rFonts w:ascii="Times New Roman" w:hAnsi="Times New Roman" w:cs="Times New Roman"/>
           <w:sz w:val="28"/>
           <w:szCs w:val="28"/>
+          <w:lang w:val="en-CA"/>
+        </w:rPr>
+      </w:r>
+      <w:r>
+        <w:rPr>
+          <w:rFonts w:ascii="Times New Roman" w:hAnsi="Times New Roman" w:cs="Times New Roman"/>
+          <w:sz w:val="28"/>
+          <w:szCs w:val="28"/>
+          <w:lang w:val="en-CA"/>
+        </w:rPr>
+      </w:r>
+      <w:r>
+        <w:rPr>
+          <w:b/>
+          <w:bCs/>
+          <w:sz w:val="28"/>
+          <w:szCs w:val="28"/>
+          <w:highlight w:val="none"/>
+          <w:lang w:val="en-CA"/>
+        </w:rPr>
+      </w:r>
+      <w:r>
+        <w:rPr>
+          <w:b/>
+          <w:bCs/>
+          <w:sz w:val="28"/>
+          <w:szCs w:val="28"/>
+          <w:highlight w:val="none"/>
+          <w:lang w:val="en-CA"/>
+        </w:rPr>
+      </w:r>
+      <w:r>
+        <w:rPr>
+          <w:b/>
+          <w:bCs/>
+          <w:sz w:val="28"/>
+          <w:szCs w:val="28"/>
+          <w:highlight w:val="none"/>
           <w:lang w:val="en-CA"/>
         </w:rPr>
       </w:r>
@@ -5057,53 +5095,45 @@
           <w:bCs w:val="0"/>
         </w:rPr>
       </w:r>
+      <w:r>
+        <w:rPr>
+          <w:b/>
+          <w:bCs/>
+          <w:sz w:val="28"/>
+          <w:szCs w:val="28"/>
+          <w:highlight w:val="none"/>
+          <w:lang w:val="en-US" w:bidi="en-US"/>
+        </w:rPr>
+      </w:r>
+      <w:r>
+        <w:rPr>
+          <w:rFonts w:ascii="Times New Roman" w:hAnsi="Times New Roman" w:cs="Times New Roman"/>
+          <w:sz w:val="28"/>
+          <w:szCs w:val="28"/>
+          <w:highlight w:val="none"/>
+          <w:lang w:val="en-US"/>
+        </w:rPr>
+      </w:r>
+      <w:r>
+        <w:rPr>
+          <w:rFonts w:ascii="Times New Roman" w:hAnsi="Times New Roman" w:cs="Times New Roman"/>
+          <w:sz w:val="28"/>
+          <w:szCs w:val="28"/>
+          <w:highlight w:val="none"/>
+          <w:lang w:val="en-US"/>
+        </w:rPr>
+      </w:r>
+      <w:r>
+        <w:rPr>
+          <w:b w:val="0"/>
+          <w:bCs w:val="0"/>
+        </w:rPr>
+      </w:r>
     </w:p>
     <w:p>
       <w:pPr>
         <w:pBdr/>
-        <w:spacing w:line="360" w:lineRule="auto"/>
-        <w:ind w:right="0" w:firstLine="0" w:left="0"/>
-        <w:rPr>
-          <w:rFonts w:ascii="Times New Roman" w:hAnsi="Times New Roman" w:cs="Times New Roman"/>
-          <w:sz w:val="28"/>
-          <w:szCs w:val="28"/>
-          <w:highlight w:val="none"/>
-          <w:lang w:val="en-US"/>
-        </w:rPr>
-      </w:pPr>
-      <w:r>
-        <w:rPr>
-          <w:b/>
-          <w:bCs/>
-          <w:sz w:val="28"/>
-          <w:szCs w:val="28"/>
-          <w:highlight w:val="none"/>
-          <w:lang w:val="en-US" w:bidi="en-US"/>
-        </w:rPr>
-      </w:r>
-      <w:r>
-        <w:rPr>
-          <w:rFonts w:ascii="Times New Roman" w:hAnsi="Times New Roman" w:cs="Times New Roman"/>
-          <w:sz w:val="28"/>
-          <w:szCs w:val="28"/>
-          <w:highlight w:val="none"/>
-          <w:lang w:val="en-US"/>
-        </w:rPr>
-      </w:r>
-      <w:r>
-        <w:rPr>
-          <w:rFonts w:ascii="Times New Roman" w:hAnsi="Times New Roman" w:cs="Times New Roman"/>
-          <w:sz w:val="28"/>
-          <w:szCs w:val="28"/>
-          <w:highlight w:val="none"/>
-          <w:lang w:val="en-US"/>
-        </w:rPr>
-      </w:r>
-    </w:p>
-    <w:p>
-      <w:pPr>
-        <w:pBdr/>
-        <w:spacing w:line="360" w:lineRule="auto"/>
+        <w:spacing w:before="240" w:line="360" w:lineRule="auto"/>
         <w:ind w:right="0" w:firstLine="709" w:left="0"/>
         <w:rPr>
           <w:rFonts w:ascii="Times New Roman" w:hAnsi="Times New Roman" w:cs="Times New Roman"/>
@@ -5986,45 +6016,6 @@
         <w:spacing w:line="360" w:lineRule="auto"/>
         <w:ind w:right="0" w:firstLine="709" w:left="0"/>
         <w:rPr>
-          <w:rFonts w:ascii="Times New Roman" w:hAnsi="Times New Roman" w:cs="Times New Roman"/>
-          <w:sz w:val="28"/>
-          <w:szCs w:val="28"/>
-          <w:lang w:val="en-US"/>
-        </w:rPr>
-      </w:pPr>
-      <w:r>
-        <w:rPr>
-          <w:rFonts w:ascii="Cambria" w:hAnsi="Cambria"/>
-          <w:b/>
-          <w:bCs/>
-          <w:sz w:val="28"/>
-          <w:szCs w:val="28"/>
-          <w:highlight w:val="none"/>
-        </w:rPr>
-      </w:r>
-      <w:r>
-        <w:rPr>
-          <w:rFonts w:ascii="Times New Roman" w:hAnsi="Times New Roman" w:cs="Times New Roman"/>
-          <w:sz w:val="28"/>
-          <w:szCs w:val="28"/>
-          <w:lang w:val="en-US"/>
-        </w:rPr>
-      </w:r>
-      <w:r>
-        <w:rPr>
-          <w:rFonts w:ascii="Times New Roman" w:hAnsi="Times New Roman" w:cs="Times New Roman"/>
-          <w:sz w:val="28"/>
-          <w:szCs w:val="28"/>
-          <w:lang w:val="en-US"/>
-        </w:rPr>
-      </w:r>
-    </w:p>
-    <w:p>
-      <w:pPr>
-        <w:pBdr/>
-        <w:spacing w:line="360" w:lineRule="auto"/>
-        <w:ind w:right="0" w:firstLine="709" w:left="0"/>
-        <w:rPr>
           <w:rFonts w:ascii="Cambria" w:hAnsi="Cambria"/>
           <w:b/>
           <w:bCs/>
@@ -7011,6 +7002,51 @@
       </w:pPr>
       <w:r>
         <w:rPr>
+          <w:rFonts w:ascii="Cambria" w:hAnsi="Cambria"/>
+          <w:b/>
+          <w:bCs/>
+          <w:sz w:val="28"/>
+          <w:szCs w:val="28"/>
+          <w:highlight w:val="none"/>
+        </w:rPr>
+      </w:r>
+      <w:r>
+        <w:rPr>
+          <w:rFonts w:ascii="Cambria" w:hAnsi="Cambria"/>
+          <w:b/>
+          <w:bCs/>
+          <w:sz w:val="28"/>
+          <w:szCs w:val="28"/>
+          <w:highlight w:val="none"/>
+        </w:rPr>
+      </w:r>
+      <w:r>
+        <w:rPr>
+          <w:rFonts w:ascii="Cambria" w:hAnsi="Cambria"/>
+          <w:b/>
+          <w:bCs/>
+          <w:sz w:val="28"/>
+          <w:szCs w:val="28"/>
+          <w:highlight w:val="none"/>
+        </w:rPr>
+      </w:r>
+    </w:p>
+    <w:p>
+      <w:pPr>
+        <w:pBdr/>
+        <w:spacing w:line="360" w:lineRule="auto"/>
+        <w:ind w:right="0" w:firstLine="709" w:left="0"/>
+        <w:rPr>
+          <w:rFonts w:ascii="Cambria" w:hAnsi="Cambria"/>
+          <w:b/>
+          <w:bCs/>
+          <w:sz w:val="28"/>
+          <w:szCs w:val="28"/>
+          <w:highlight w:val="none"/>
+        </w:rPr>
+      </w:pPr>
+      <w:r>
+        <w:rPr>
           <w:rFonts w:ascii="Times New Roman" w:hAnsi="Times New Roman" w:cs="Times New Roman"/>
           <w:sz w:val="28"/>
           <w:szCs w:val="28"/>
@@ -7164,7 +7200,7 @@
           <mc:Choice Requires="wpg">
             <w:drawing>
               <wp:inline xmlns:wp="http://schemas.openxmlformats.org/drawingml/2006/wordprocessingDrawing" distT="0" distB="0" distL="0" distR="0">
-                <wp:extent cx="2497847" cy="5245478"/>
+                <wp:extent cx="2947483" cy="5894967"/>
                 <wp:effectExtent l="0" t="0" r="0" b="0"/>
                 <wp:docPr id="5" name=""/>
                 <wp:cNvGraphicFramePr>
@@ -7174,7 +7210,7 @@
                   <a:graphicData uri="http://schemas.openxmlformats.org/drawingml/2006/picture">
                     <pic:pic xmlns:pic="http://schemas.openxmlformats.org/drawingml/2006/picture">
                       <pic:nvPicPr>
-                        <pic:cNvPr id="2010463223" name=""/>
+                        <pic:cNvPr id="77270640" name=""/>
                         <pic:cNvPicPr>
                           <a:picLocks noChangeAspect="1"/>
                         </pic:cNvPicPr>
@@ -7187,7 +7223,7 @@
                       <pic:spPr bwMode="auto">
                         <a:xfrm flipH="0" flipV="0">
                           <a:off x="0" y="0"/>
-                          <a:ext cx="2497846" cy="5245477"/>
+                          <a:ext cx="2947483" cy="5894966"/>
                         </a:xfrm>
                         <a:prstGeom prst="rect">
                           <a:avLst/>
@@ -7220,7 +7256,7 @@
                 <v:path o:extrusionok="f" gradientshapeok="t" o:connecttype="rect"/>
                 <o:lock v:ext="edit" aspectratio="t"/>
               </v:shapetype>
-              <v:shape id="_x0000_i4" o:spid="_x0000_s4" type="#_x0000_t75" style="width:196.68pt;height:413.03pt;mso-wrap-distance-left:0.00pt;mso-wrap-distance-top:0.00pt;mso-wrap-distance-right:0.00pt;mso-wrap-distance-bottom:0.00pt;z-index:1;" stroked="false">
+              <v:shape id="_x0000_i4" o:spid="_x0000_s4" type="#_x0000_t75" style="width:232.09pt;height:464.17pt;mso-wrap-distance-left:0.00pt;mso-wrap-distance-top:0.00pt;mso-wrap-distance-right:0.00pt;mso-wrap-distance-bottom:0.00pt;z-index:1;" stroked="false">
                 <v:imagedata r:id="rId16" o:title=""/>
                 <o:lock v:ext="edit" rotation="t"/>
               </v:shape>
@@ -7746,18 +7782,14 @@
         <w:t xml:space="preserve">)</w:t>
       </w:r>
       <w:r/>
-    </w:p>
-    <w:p>
-      <w:pPr>
-        <w:pBdr/>
-        <w:spacing w:line="360" w:lineRule="auto"/>
-        <w:ind w:right="0" w:firstLine="709" w:left="0"/>
+      <w:r>
         <w:rPr>
           <w:rFonts w:ascii="Times New Roman" w:hAnsi="Times New Roman" w:cs="Times New Roman"/>
           <w:sz w:val="28"/>
           <w:szCs w:val="28"/>
-        </w:rPr>
-      </w:pPr>
+          <w:highlight w:val="none"/>
+        </w:rPr>
+      </w:r>
       <w:r>
         <w:rPr>
           <w:rFonts w:ascii="Times New Roman" w:hAnsi="Times New Roman" w:cs="Times New Roman"/>
@@ -7772,47 +7804,7 @@
           <w:szCs w:val="28"/>
         </w:rPr>
       </w:r>
-      <w:r>
-        <w:rPr>
-          <w:rFonts w:ascii="Times New Roman" w:hAnsi="Times New Roman" w:cs="Times New Roman"/>
-          <w:sz w:val="28"/>
-          <w:szCs w:val="28"/>
-        </w:rPr>
-      </w:r>
-    </w:p>
-    <w:p>
-      <w:pPr>
-        <w:pBdr/>
-        <w:spacing w:line="360" w:lineRule="auto"/>
-        <w:ind w:right="0" w:firstLine="709" w:left="0"/>
-        <w:rPr>
-          <w:rFonts w:ascii="Times New Roman" w:hAnsi="Times New Roman" w:cs="Times New Roman"/>
-          <w:sz w:val="28"/>
-          <w:szCs w:val="28"/>
-        </w:rPr>
-      </w:pPr>
-      <w:r>
-        <w:rPr>
-          <w:rFonts w:ascii="Times New Roman" w:hAnsi="Times New Roman" w:cs="Times New Roman"/>
-          <w:sz w:val="28"/>
-          <w:szCs w:val="28"/>
-          <w:highlight w:val="none"/>
-        </w:rPr>
-      </w:r>
-      <w:r>
-        <w:rPr>
-          <w:rFonts w:ascii="Times New Roman" w:hAnsi="Times New Roman" w:cs="Times New Roman"/>
-          <w:sz w:val="28"/>
-          <w:szCs w:val="28"/>
-        </w:rPr>
-      </w:r>
-      <w:r>
-        <w:rPr>
-          <w:rFonts w:ascii="Times New Roman" w:hAnsi="Times New Roman" w:cs="Times New Roman"/>
-          <w:sz w:val="28"/>
-          <w:szCs w:val="28"/>
-        </w:rPr>
-      </w:r>
+      <w:r/>
     </w:p>
     <w:p>
       <w:pPr>
@@ -10223,7 +10215,7 @@
       <w:pPr>
         <w:pBdr/>
         <w:spacing w:line="360" w:lineRule="auto"/>
-        <w:ind w:right="0" w:firstLine="0" w:left="0"/>
+        <w:ind w:right="0" w:hanging="425" w:left="0"/>
         <w:rPr>
           <w:rFonts w:ascii="Times New Roman" w:hAnsi="Times New Roman" w:cs="Times New Roman"/>
           <w:sz w:val="28"/>
@@ -10245,7 +10237,7 @@
           <mc:Choice Requires="wpg">
             <w:drawing>
               <wp:inline xmlns:wp="http://schemas.openxmlformats.org/drawingml/2006/wordprocessingDrawing" distT="0" distB="0" distL="0" distR="0">
-                <wp:extent cx="6261422" cy="5556307"/>
+                <wp:extent cx="6571509" cy="5831474"/>
                 <wp:effectExtent l="0" t="0" r="0" b="0"/>
                 <wp:docPr id="7" name=""/>
                 <wp:cNvGraphicFramePr>
@@ -10268,7 +10260,7 @@
                       <pic:spPr bwMode="auto">
                         <a:xfrm flipH="0" flipV="0">
                           <a:off x="0" y="0"/>
-                          <a:ext cx="6261422" cy="5556307"/>
+                          <a:ext cx="6571508" cy="5831474"/>
                         </a:xfrm>
                         <a:prstGeom prst="rect">
                           <a:avLst/>
@@ -10301,7 +10293,7 @@
                 <v:path o:extrusionok="f" gradientshapeok="t" o:connecttype="rect"/>
                 <o:lock v:ext="edit" aspectratio="t"/>
               </v:shapetype>
-              <v:shape id="_x0000_i6" o:spid="_x0000_s6" type="#_x0000_t75" style="width:493.03pt;height:437.50pt;mso-wrap-distance-left:0.00pt;mso-wrap-distance-top:0.00pt;mso-wrap-distance-right:0.00pt;mso-wrap-distance-bottom:0.00pt;z-index:1;" stroked="false">
+              <v:shape id="_x0000_i6" o:spid="_x0000_s6" type="#_x0000_t75" style="width:517.44pt;height:459.17pt;mso-wrap-distance-left:0.00pt;mso-wrap-distance-top:0.00pt;mso-wrap-distance-right:0.00pt;mso-wrap-distance-bottom:0.00pt;z-index:1;" stroked="false">
                 <v:imagedata r:id="rId18" o:title=""/>
                 <o:lock v:ext="edit" rotation="t"/>
               </v:shape>
@@ -10377,7 +10369,7 @@
       <w:pPr>
         <w:pBdr/>
         <w:spacing w:line="360" w:lineRule="auto"/>
-        <w:ind w:right="0" w:firstLine="709" w:left="0"/>
+        <w:ind w:right="0" w:firstLine="0" w:left="0"/>
         <w:rPr>
           <w:b/>
           <w:bCs/>
@@ -10422,52 +10414,7 @@
       <w:pPr>
         <w:pBdr/>
         <w:spacing w:line="360" w:lineRule="auto"/>
-        <w:ind w:right="0" w:firstLine="709" w:left="0"/>
-        <w:rPr>
-          <w:b/>
-          <w:bCs/>
-          <w:sz w:val="28"/>
-          <w:szCs w:val="28"/>
-          <w:highlight w:val="none"/>
-          <w:lang w:val="en-CA"/>
-        </w:rPr>
-      </w:pPr>
-      <w:r>
-        <w:rPr>
-          <w:b/>
-          <w:bCs/>
-          <w:sz w:val="28"/>
-          <w:szCs w:val="28"/>
-          <w:highlight w:val="none"/>
-          <w:lang w:val="en-CA"/>
-        </w:rPr>
-      </w:r>
-      <w:r>
-        <w:rPr>
-          <w:b/>
-          <w:bCs/>
-          <w:sz w:val="28"/>
-          <w:szCs w:val="28"/>
-          <w:highlight w:val="none"/>
-          <w:lang w:val="en-CA"/>
-        </w:rPr>
-      </w:r>
-      <w:r>
-        <w:rPr>
-          <w:b/>
-          <w:bCs/>
-          <w:sz w:val="28"/>
-          <w:szCs w:val="28"/>
-          <w:highlight w:val="none"/>
-          <w:lang w:val="en-CA"/>
-        </w:rPr>
-      </w:r>
-    </w:p>
-    <w:p>
-      <w:pPr>
-        <w:pBdr/>
-        <w:spacing w:line="360" w:lineRule="auto"/>
-        <w:ind w:right="0" w:firstLine="709" w:left="0"/>
+        <w:ind w:right="0" w:firstLine="0" w:left="0"/>
         <w:rPr>
           <w:b/>
           <w:bCs/>
@@ -11613,12 +11560,6 @@
         <w:ind w:right="0" w:firstLine="709" w:left="0"/>
         <w:jc w:val="center"/>
         <w:rPr>
-          <w:sz w:val="28"/>
-          <w:szCs w:val="28"/>
-        </w:rPr>
-      </w:pPr>
-      <w:r>
-        <w:rPr>
           <w:rFonts w:ascii="Cambria" w:hAnsi="Cambria"/>
           <w:b/>
           <w:bCs/>
@@ -11627,17 +11568,38 @@
           <w:highlight w:val="none"/>
           <w:lang w:val="en-US"/>
         </w:rPr>
-      </w:r>
-      <w:r>
-        <w:rPr>
-          <w:sz w:val="28"/>
-          <w:szCs w:val="28"/>
-        </w:rPr>
-      </w:r>
-      <w:r>
-        <w:rPr>
-          <w:sz w:val="28"/>
-          <w:szCs w:val="28"/>
+      </w:pPr>
+      <w:r>
+        <w:rPr>
+          <w:rFonts w:ascii="Cambria" w:hAnsi="Cambria"/>
+          <w:b/>
+          <w:bCs/>
+          <w:sz w:val="28"/>
+          <w:szCs w:val="28"/>
+          <w:highlight w:val="none"/>
+          <w:lang w:val="en-US"/>
+        </w:rPr>
+      </w:r>
+      <w:r>
+        <w:rPr>
+          <w:rFonts w:ascii="Cambria" w:hAnsi="Cambria"/>
+          <w:b/>
+          <w:bCs/>
+          <w:sz w:val="28"/>
+          <w:szCs w:val="28"/>
+          <w:highlight w:val="none"/>
+          <w:lang w:val="en-US"/>
+        </w:rPr>
+      </w:r>
+      <w:r>
+        <w:rPr>
+          <w:rFonts w:ascii="Cambria" w:hAnsi="Cambria"/>
+          <w:b/>
+          <w:bCs/>
+          <w:sz w:val="28"/>
+          <w:szCs w:val="28"/>
+          <w:highlight w:val="none"/>
+          <w:lang w:val="en-US"/>
         </w:rPr>
       </w:r>
     </w:p>
@@ -11649,66 +11611,24 @@
         <w:jc w:val="center"/>
         <w:rPr>
           <w:rFonts w:ascii="Cambria" w:hAnsi="Cambria"/>
-          <w:b w:val="0"/>
-          <w:bCs w:val="0"/>
-          <w:i w:val="0"/>
-          <w:sz w:val="28"/>
-          <w:szCs w:val="28"/>
-          <w:highlight w:val="none"/>
-        </w:rPr>
-      </w:pPr>
-      <w:r>
-        <w:rPr>
-          <w:rFonts w:ascii="Cambria" w:hAnsi="Cambria"/>
-          <w:b w:val="0"/>
-          <w:bCs w:val="0"/>
-          <w:i w:val="0"/>
-          <w:iCs w:val="0"/>
+          <w:b/>
+          <w:bCs/>
           <w:sz w:val="28"/>
           <w:szCs w:val="28"/>
           <w:highlight w:val="none"/>
           <w:lang w:val="en-US"/>
         </w:rPr>
-      </w:r>
-      <w:r>
-        <w:rPr>
-          <w:rFonts w:ascii="Cambria" w:hAnsi="Cambria"/>
-          <w:b w:val="0"/>
-          <w:bCs w:val="0"/>
-          <w:i w:val="0"/>
-          <w:sz w:val="28"/>
-          <w:szCs w:val="28"/>
-          <w:highlight w:val="none"/>
-        </w:rPr>
-      </w:r>
-      <w:r>
-        <w:rPr>
-          <w:rFonts w:ascii="Cambria" w:hAnsi="Cambria"/>
-          <w:b w:val="0"/>
-          <w:bCs w:val="0"/>
-          <w:i w:val="0"/>
-          <w:sz w:val="28"/>
-          <w:szCs w:val="28"/>
-          <w:highlight w:val="none"/>
-        </w:rPr>
-      </w:r>
-    </w:p>
-    <w:p>
-      <w:pPr>
-        <w:pBdr/>
-        <w:spacing w:before="240" w:line="360" w:lineRule="auto"/>
-        <w:ind w:right="0" w:firstLine="709" w:left="0"/>
-        <w:jc w:val="center"/>
+      </w:pPr>
+      <w:r>
         <w:rPr>
           <w:rFonts w:ascii="Cambria" w:hAnsi="Cambria"/>
           <w:b/>
           <w:bCs/>
           <w:sz w:val="28"/>
           <w:szCs w:val="28"/>
-          <w:highlight w:val="none"/>
-          <w:lang w:val="en-US"/>
-        </w:rPr>
-      </w:pPr>
+        </w:rPr>
+        <w:t xml:space="preserve">Задание</w:t>
+      </w:r>
       <w:r>
         <w:rPr>
           <w:rFonts w:ascii="Cambria" w:hAnsi="Cambria"/>
@@ -11716,9 +11636,9 @@
           <w:bCs/>
           <w:sz w:val="28"/>
           <w:szCs w:val="28"/>
-          <w:highlight w:val="none"/>
           <w:lang w:val="en-US"/>
         </w:rPr>
+        <w:t xml:space="preserve"> </w:t>
       </w:r>
       <w:r>
         <w:rPr>
@@ -11727,9 +11647,8 @@
           <w:bCs/>
           <w:sz w:val="28"/>
           <w:szCs w:val="28"/>
-          <w:highlight w:val="none"/>
-          <w:lang w:val="en-US"/>
-        </w:rPr>
+        </w:rPr>
+        <w:t xml:space="preserve">№</w:t>
       </w:r>
       <w:r>
         <w:rPr>
@@ -11738,17 +11657,11 @@
           <w:bCs/>
           <w:sz w:val="28"/>
           <w:szCs w:val="28"/>
-          <w:highlight w:val="none"/>
           <w:lang w:val="en-US"/>
         </w:rPr>
-      </w:r>
-    </w:p>
-    <w:p>
-      <w:pPr>
-        <w:pBdr/>
-        <w:spacing w:before="240" w:line="360" w:lineRule="auto"/>
-        <w:ind w:right="0" w:firstLine="709" w:left="0"/>
-        <w:jc w:val="center"/>
+        <w:t xml:space="preserve">3.2</w:t>
+      </w:r>
+      <w:r>
         <w:rPr>
           <w:rFonts w:ascii="Cambria" w:hAnsi="Cambria"/>
           <w:b/>
@@ -11758,7 +11671,7 @@
           <w:highlight w:val="none"/>
           <w:lang w:val="en-US"/>
         </w:rPr>
-      </w:pPr>
+      </w:r>
       <w:r>
         <w:rPr>
           <w:rFonts w:ascii="Cambria" w:hAnsi="Cambria"/>
@@ -11770,6 +11683,71 @@
           <w:lang w:val="en-US"/>
         </w:rPr>
       </w:r>
+    </w:p>
+    <w:p>
+      <w:pPr>
+        <w:pBdr/>
+        <w:spacing w:line="360" w:lineRule="auto"/>
+        <w:ind w:right="0" w:firstLine="709" w:left="0"/>
+        <w:rPr>
+          <w:rFonts w:ascii="Times New Roman" w:hAnsi="Times New Roman" w:cs="Times New Roman"/>
+          <w:sz w:val="28"/>
+          <w:szCs w:val="28"/>
+        </w:rPr>
+      </w:pPr>
+      <w:r>
+        <w:rPr>
+          <w:rFonts w:ascii="Times New Roman" w:hAnsi="Times New Roman" w:cs="Times New Roman"/>
+          <w:sz w:val="28"/>
+          <w:szCs w:val="28"/>
+        </w:rPr>
+        <w:t xml:space="preserve">Нарисовать оператор цикла для выполнения действий</w:t>
+      </w:r>
+      <w:r>
+        <w:rPr>
+          <w:rFonts w:ascii="Times New Roman" w:hAnsi="Times New Roman" w:cs="Times New Roman"/>
+          <w:sz w:val="28"/>
+          <w:szCs w:val="28"/>
+          <w:lang w:val="en-US"/>
+        </w:rPr>
+        <w:t xml:space="preserve">.</w:t>
+      </w:r>
+      <w:r>
+        <w:rPr>
+          <w:rFonts w:ascii="Times New Roman" w:hAnsi="Times New Roman" w:cs="Times New Roman"/>
+          <w:sz w:val="28"/>
+          <w:szCs w:val="28"/>
+        </w:rPr>
+      </w:r>
+      <w:r>
+        <w:rPr>
+          <w:rFonts w:ascii="Times New Roman" w:hAnsi="Times New Roman" w:cs="Times New Roman"/>
+          <w:sz w:val="28"/>
+          <w:szCs w:val="28"/>
+        </w:rPr>
+      </w:r>
+    </w:p>
+    <w:p>
+      <w:pPr>
+        <w:pBdr/>
+        <w:spacing w:line="360" w:lineRule="auto"/>
+        <w:ind w:right="0" w:firstLine="709" w:left="0"/>
+        <w:rPr>
+          <w:rFonts w:ascii="Times New Roman" w:hAnsi="Times New Roman" w:cs="Times New Roman"/>
+          <w:sz w:val="28"/>
+          <w:szCs w:val="28"/>
+          <w:lang w:val="en-US"/>
+        </w:rPr>
+      </w:pPr>
+      <w:r>
+        <w:rPr>
+          <w:rFonts w:ascii="Times New Roman" w:hAnsi="Times New Roman" w:cs="Times New Roman"/>
+          <w:sz w:val="28"/>
+          <w:szCs w:val="28"/>
+          <w:highlight w:val="none"/>
+          <w:lang w:val="en-US" w:bidi="en-US"/>
+        </w:rPr>
+      </w:r>
       <w:r>
         <w:rPr>
           <w:rFonts w:ascii="Cambria" w:hAnsi="Cambria"/>
@@ -11777,9 +11755,8 @@
           <w:bCs/>
           <w:sz w:val="28"/>
           <w:szCs w:val="28"/>
-          <w:highlight w:val="none"/>
-          <w:lang w:val="en-US"/>
-        </w:rPr>
+        </w:rPr>
+        <w:t xml:space="preserve">Вариант</w:t>
       </w:r>
       <w:r>
         <w:rPr>
@@ -11788,623 +11765,6 @@
           <w:bCs/>
           <w:sz w:val="28"/>
           <w:szCs w:val="28"/>
-          <w:highlight w:val="none"/>
-          <w:lang w:val="en-US"/>
-        </w:rPr>
-      </w:r>
-    </w:p>
-    <w:p>
-      <w:pPr>
-        <w:pBdr/>
-        <w:spacing w:before="240" w:line="360" w:lineRule="auto"/>
-        <w:ind w:right="0" w:firstLine="709" w:left="0"/>
-        <w:jc w:val="center"/>
-        <w:rPr>
-          <w:rFonts w:ascii="Cambria" w:hAnsi="Cambria"/>
-          <w:b/>
-          <w:bCs/>
-          <w:sz w:val="28"/>
-          <w:szCs w:val="28"/>
-          <w:highlight w:val="none"/>
-          <w:lang w:val="en-US"/>
-        </w:rPr>
-      </w:pPr>
-      <w:r>
-        <w:rPr>
-          <w:rFonts w:ascii="Cambria" w:hAnsi="Cambria"/>
-          <w:b/>
-          <w:bCs/>
-          <w:sz w:val="28"/>
-          <w:szCs w:val="28"/>
-          <w:highlight w:val="none"/>
-          <w:lang w:val="en-US"/>
-        </w:rPr>
-      </w:r>
-      <w:r>
-        <w:rPr>
-          <w:rFonts w:ascii="Cambria" w:hAnsi="Cambria"/>
-          <w:b/>
-          <w:bCs/>
-          <w:sz w:val="28"/>
-          <w:szCs w:val="28"/>
-          <w:highlight w:val="none"/>
-          <w:lang w:val="en-US"/>
-        </w:rPr>
-      </w:r>
-      <w:r>
-        <w:rPr>
-          <w:rFonts w:ascii="Cambria" w:hAnsi="Cambria"/>
-          <w:b/>
-          <w:bCs/>
-          <w:sz w:val="28"/>
-          <w:szCs w:val="28"/>
-          <w:highlight w:val="none"/>
-          <w:lang w:val="en-US"/>
-        </w:rPr>
-      </w:r>
-    </w:p>
-    <w:p>
-      <w:pPr>
-        <w:pBdr/>
-        <w:spacing w:before="240" w:line="360" w:lineRule="auto"/>
-        <w:ind w:right="0" w:firstLine="709" w:left="0"/>
-        <w:jc w:val="center"/>
-        <w:rPr>
-          <w:rFonts w:ascii="Cambria" w:hAnsi="Cambria"/>
-          <w:b/>
-          <w:bCs/>
-          <w:sz w:val="28"/>
-          <w:szCs w:val="28"/>
-          <w:highlight w:val="none"/>
-          <w:lang w:val="en-US"/>
-        </w:rPr>
-      </w:pPr>
-      <w:r>
-        <w:rPr>
-          <w:rFonts w:ascii="Cambria" w:hAnsi="Cambria"/>
-          <w:b/>
-          <w:bCs/>
-          <w:sz w:val="28"/>
-          <w:szCs w:val="28"/>
-          <w:highlight w:val="none"/>
-          <w:lang w:val="en-US"/>
-        </w:rPr>
-      </w:r>
-      <w:r>
-        <w:rPr>
-          <w:rFonts w:ascii="Cambria" w:hAnsi="Cambria"/>
-          <w:b/>
-          <w:bCs/>
-          <w:sz w:val="28"/>
-          <w:szCs w:val="28"/>
-          <w:highlight w:val="none"/>
-          <w:lang w:val="en-US"/>
-        </w:rPr>
-      </w:r>
-      <w:r>
-        <w:rPr>
-          <w:rFonts w:ascii="Cambria" w:hAnsi="Cambria"/>
-          <w:b/>
-          <w:bCs/>
-          <w:sz w:val="28"/>
-          <w:szCs w:val="28"/>
-          <w:highlight w:val="none"/>
-          <w:lang w:val="en-US"/>
-        </w:rPr>
-      </w:r>
-    </w:p>
-    <w:p>
-      <w:pPr>
-        <w:pBdr/>
-        <w:spacing w:before="240" w:line="360" w:lineRule="auto"/>
-        <w:ind w:right="0" w:firstLine="709" w:left="0"/>
-        <w:jc w:val="center"/>
-        <w:rPr>
-          <w:rFonts w:ascii="Cambria" w:hAnsi="Cambria"/>
-          <w:b/>
-          <w:bCs/>
-          <w:sz w:val="28"/>
-          <w:szCs w:val="28"/>
-          <w:highlight w:val="none"/>
-          <w:lang w:val="en-US"/>
-        </w:rPr>
-      </w:pPr>
-      <w:r>
-        <w:rPr>
-          <w:rFonts w:ascii="Cambria" w:hAnsi="Cambria"/>
-          <w:b/>
-          <w:bCs/>
-          <w:sz w:val="28"/>
-          <w:szCs w:val="28"/>
-          <w:highlight w:val="none"/>
-          <w:lang w:val="en-US"/>
-        </w:rPr>
-      </w:r>
-      <w:r>
-        <w:rPr>
-          <w:rFonts w:ascii="Cambria" w:hAnsi="Cambria"/>
-          <w:b/>
-          <w:bCs/>
-          <w:sz w:val="28"/>
-          <w:szCs w:val="28"/>
-          <w:highlight w:val="none"/>
-          <w:lang w:val="en-US"/>
-        </w:rPr>
-      </w:r>
-      <w:r>
-        <w:rPr>
-          <w:rFonts w:ascii="Cambria" w:hAnsi="Cambria"/>
-          <w:b/>
-          <w:bCs/>
-          <w:sz w:val="28"/>
-          <w:szCs w:val="28"/>
-          <w:highlight w:val="none"/>
-          <w:lang w:val="en-US"/>
-        </w:rPr>
-      </w:r>
-    </w:p>
-    <w:p>
-      <w:pPr>
-        <w:pBdr/>
-        <w:spacing w:before="240" w:line="360" w:lineRule="auto"/>
-        <w:ind w:right="0" w:firstLine="709" w:left="0"/>
-        <w:jc w:val="center"/>
-        <w:rPr>
-          <w:rFonts w:ascii="Cambria" w:hAnsi="Cambria"/>
-          <w:b/>
-          <w:bCs/>
-          <w:sz w:val="28"/>
-          <w:szCs w:val="28"/>
-          <w:highlight w:val="none"/>
-          <w:lang w:val="en-US"/>
-        </w:rPr>
-      </w:pPr>
-      <w:r>
-        <w:rPr>
-          <w:rFonts w:ascii="Cambria" w:hAnsi="Cambria"/>
-          <w:b/>
-          <w:bCs/>
-          <w:sz w:val="28"/>
-          <w:szCs w:val="28"/>
-          <w:highlight w:val="none"/>
-          <w:lang w:val="en-US"/>
-        </w:rPr>
-      </w:r>
-      <w:r>
-        <w:rPr>
-          <w:rFonts w:ascii="Cambria" w:hAnsi="Cambria"/>
-          <w:b/>
-          <w:bCs/>
-          <w:sz w:val="28"/>
-          <w:szCs w:val="28"/>
-          <w:highlight w:val="none"/>
-          <w:lang w:val="en-US"/>
-        </w:rPr>
-      </w:r>
-      <w:r>
-        <w:rPr>
-          <w:rFonts w:ascii="Cambria" w:hAnsi="Cambria"/>
-          <w:b/>
-          <w:bCs/>
-          <w:sz w:val="28"/>
-          <w:szCs w:val="28"/>
-          <w:highlight w:val="none"/>
-          <w:lang w:val="en-US"/>
-        </w:rPr>
-      </w:r>
-    </w:p>
-    <w:p>
-      <w:pPr>
-        <w:pBdr/>
-        <w:spacing w:before="240" w:line="360" w:lineRule="auto"/>
-        <w:ind w:right="0" w:firstLine="709" w:left="0"/>
-        <w:jc w:val="center"/>
-        <w:rPr>
-          <w:rFonts w:ascii="Cambria" w:hAnsi="Cambria"/>
-          <w:b/>
-          <w:bCs/>
-          <w:sz w:val="28"/>
-          <w:szCs w:val="28"/>
-          <w:highlight w:val="none"/>
-          <w:lang w:val="en-US"/>
-        </w:rPr>
-      </w:pPr>
-      <w:r>
-        <w:rPr>
-          <w:rFonts w:ascii="Cambria" w:hAnsi="Cambria"/>
-          <w:b/>
-          <w:bCs/>
-          <w:sz w:val="28"/>
-          <w:szCs w:val="28"/>
-          <w:highlight w:val="none"/>
-          <w:lang w:val="en-US"/>
-        </w:rPr>
-      </w:r>
-      <w:r>
-        <w:rPr>
-          <w:rFonts w:ascii="Cambria" w:hAnsi="Cambria"/>
-          <w:b/>
-          <w:bCs/>
-          <w:sz w:val="28"/>
-          <w:szCs w:val="28"/>
-          <w:highlight w:val="none"/>
-          <w:lang w:val="en-US"/>
-        </w:rPr>
-      </w:r>
-      <w:r>
-        <w:rPr>
-          <w:rFonts w:ascii="Cambria" w:hAnsi="Cambria"/>
-          <w:b/>
-          <w:bCs/>
-          <w:sz w:val="28"/>
-          <w:szCs w:val="28"/>
-          <w:highlight w:val="none"/>
-          <w:lang w:val="en-US"/>
-        </w:rPr>
-      </w:r>
-    </w:p>
-    <w:p>
-      <w:pPr>
-        <w:pBdr/>
-        <w:spacing w:before="240" w:line="360" w:lineRule="auto"/>
-        <w:ind w:right="0" w:firstLine="709" w:left="0"/>
-        <w:jc w:val="center"/>
-        <w:rPr>
-          <w:rFonts w:ascii="Cambria" w:hAnsi="Cambria"/>
-          <w:b/>
-          <w:bCs/>
-          <w:sz w:val="28"/>
-          <w:szCs w:val="28"/>
-          <w:highlight w:val="none"/>
-          <w:lang w:val="en-US"/>
-        </w:rPr>
-      </w:pPr>
-      <w:r>
-        <w:rPr>
-          <w:rFonts w:ascii="Cambria" w:hAnsi="Cambria"/>
-          <w:b/>
-          <w:bCs/>
-          <w:sz w:val="28"/>
-          <w:szCs w:val="28"/>
-          <w:highlight w:val="none"/>
-          <w:lang w:val="en-US"/>
-        </w:rPr>
-      </w:r>
-      <w:r>
-        <w:rPr>
-          <w:rFonts w:ascii="Cambria" w:hAnsi="Cambria"/>
-          <w:b/>
-          <w:bCs/>
-          <w:sz w:val="28"/>
-          <w:szCs w:val="28"/>
-          <w:highlight w:val="none"/>
-          <w:lang w:val="en-US"/>
-        </w:rPr>
-      </w:r>
-      <w:r>
-        <w:rPr>
-          <w:rFonts w:ascii="Cambria" w:hAnsi="Cambria"/>
-          <w:b/>
-          <w:bCs/>
-          <w:sz w:val="28"/>
-          <w:szCs w:val="28"/>
-          <w:highlight w:val="none"/>
-          <w:lang w:val="en-US"/>
-        </w:rPr>
-      </w:r>
-    </w:p>
-    <w:p>
-      <w:pPr>
-        <w:pBdr/>
-        <w:spacing w:before="240" w:line="360" w:lineRule="auto"/>
-        <w:ind w:right="0" w:firstLine="709" w:left="0"/>
-        <w:jc w:val="center"/>
-        <w:rPr>
-          <w:rFonts w:ascii="Cambria" w:hAnsi="Cambria"/>
-          <w:b/>
-          <w:bCs/>
-          <w:sz w:val="28"/>
-          <w:szCs w:val="28"/>
-          <w:highlight w:val="none"/>
-          <w:lang w:val="en-US"/>
-        </w:rPr>
-      </w:pPr>
-      <w:r>
-        <w:rPr>
-          <w:rFonts w:ascii="Cambria" w:hAnsi="Cambria"/>
-          <w:b/>
-          <w:bCs/>
-          <w:sz w:val="28"/>
-          <w:szCs w:val="28"/>
-          <w:highlight w:val="none"/>
-          <w:lang w:val="en-US"/>
-        </w:rPr>
-      </w:r>
-      <w:r>
-        <w:rPr>
-          <w:rFonts w:ascii="Cambria" w:hAnsi="Cambria"/>
-          <w:b/>
-          <w:bCs/>
-          <w:sz w:val="28"/>
-          <w:szCs w:val="28"/>
-          <w:highlight w:val="none"/>
-          <w:lang w:val="en-US"/>
-        </w:rPr>
-      </w:r>
-      <w:r>
-        <w:rPr>
-          <w:rFonts w:ascii="Cambria" w:hAnsi="Cambria"/>
-          <w:b/>
-          <w:bCs/>
-          <w:sz w:val="28"/>
-          <w:szCs w:val="28"/>
-          <w:highlight w:val="none"/>
-          <w:lang w:val="en-US"/>
-        </w:rPr>
-      </w:r>
-    </w:p>
-    <w:p>
-      <w:pPr>
-        <w:pBdr/>
-        <w:spacing w:before="240" w:line="360" w:lineRule="auto"/>
-        <w:ind w:right="0" w:firstLine="709" w:left="0"/>
-        <w:jc w:val="center"/>
-        <w:rPr>
-          <w:rFonts w:ascii="Cambria" w:hAnsi="Cambria"/>
-          <w:b/>
-          <w:bCs/>
-          <w:sz w:val="28"/>
-          <w:szCs w:val="28"/>
-          <w:highlight w:val="none"/>
-          <w:lang w:val="en-US"/>
-        </w:rPr>
-      </w:pPr>
-      <w:r>
-        <w:rPr>
-          <w:rFonts w:ascii="Cambria" w:hAnsi="Cambria"/>
-          <w:b/>
-          <w:bCs/>
-          <w:sz w:val="28"/>
-          <w:szCs w:val="28"/>
-          <w:highlight w:val="none"/>
-          <w:lang w:val="en-US"/>
-        </w:rPr>
-      </w:r>
-      <w:r>
-        <w:rPr>
-          <w:rFonts w:ascii="Cambria" w:hAnsi="Cambria"/>
-          <w:b/>
-          <w:bCs/>
-          <w:sz w:val="28"/>
-          <w:szCs w:val="28"/>
-          <w:highlight w:val="none"/>
-          <w:lang w:val="en-US"/>
-        </w:rPr>
-      </w:r>
-      <w:r>
-        <w:rPr>
-          <w:rFonts w:ascii="Cambria" w:hAnsi="Cambria"/>
-          <w:b/>
-          <w:bCs/>
-          <w:sz w:val="28"/>
-          <w:szCs w:val="28"/>
-          <w:highlight w:val="none"/>
-          <w:lang w:val="en-US"/>
-        </w:rPr>
-      </w:r>
-    </w:p>
-    <w:p>
-      <w:pPr>
-        <w:pBdr/>
-        <w:spacing w:before="240" w:line="360" w:lineRule="auto"/>
-        <w:ind w:right="0" w:firstLine="709" w:left="0"/>
-        <w:jc w:val="center"/>
-        <w:rPr>
-          <w:rFonts w:ascii="Cambria" w:hAnsi="Cambria"/>
-          <w:b/>
-          <w:bCs/>
-          <w:sz w:val="28"/>
-          <w:szCs w:val="28"/>
-          <w:highlight w:val="none"/>
-          <w:lang w:val="en-US"/>
-        </w:rPr>
-      </w:pPr>
-      <w:r>
-        <w:rPr>
-          <w:rFonts w:ascii="Cambria" w:hAnsi="Cambria"/>
-          <w:b/>
-          <w:bCs/>
-          <w:sz w:val="28"/>
-          <w:szCs w:val="28"/>
-          <w:highlight w:val="none"/>
-          <w:lang w:val="en-US"/>
-        </w:rPr>
-      </w:r>
-      <w:r>
-        <w:rPr>
-          <w:rFonts w:ascii="Cambria" w:hAnsi="Cambria"/>
-          <w:b/>
-          <w:bCs/>
-          <w:sz w:val="28"/>
-          <w:szCs w:val="28"/>
-          <w:highlight w:val="none"/>
-          <w:lang w:val="en-US"/>
-        </w:rPr>
-      </w:r>
-      <w:r>
-        <w:rPr>
-          <w:rFonts w:ascii="Cambria" w:hAnsi="Cambria"/>
-          <w:b/>
-          <w:bCs/>
-          <w:sz w:val="28"/>
-          <w:szCs w:val="28"/>
-          <w:highlight w:val="none"/>
-          <w:lang w:val="en-US"/>
-        </w:rPr>
-      </w:r>
-    </w:p>
-    <w:p>
-      <w:pPr>
-        <w:pBdr/>
-        <w:spacing w:before="240" w:line="360" w:lineRule="auto"/>
-        <w:ind w:right="0" w:firstLine="709" w:left="0"/>
-        <w:jc w:val="center"/>
-        <w:rPr>
-          <w:rFonts w:ascii="Cambria" w:hAnsi="Cambria"/>
-          <w:b/>
-          <w:bCs/>
-          <w:sz w:val="28"/>
-          <w:szCs w:val="28"/>
-          <w:highlight w:val="none"/>
-          <w:lang w:val="en-US"/>
-        </w:rPr>
-      </w:pPr>
-      <w:r>
-        <w:rPr>
-          <w:rFonts w:ascii="Cambria" w:hAnsi="Cambria"/>
-          <w:b/>
-          <w:bCs/>
-          <w:sz w:val="28"/>
-          <w:szCs w:val="28"/>
-        </w:rPr>
-        <w:t xml:space="preserve">Задание</w:t>
-      </w:r>
-      <w:r>
-        <w:rPr>
-          <w:rFonts w:ascii="Cambria" w:hAnsi="Cambria"/>
-          <w:b/>
-          <w:bCs/>
-          <w:sz w:val="28"/>
-          <w:szCs w:val="28"/>
-          <w:lang w:val="en-US"/>
-        </w:rPr>
-        <w:t xml:space="preserve"> </w:t>
-      </w:r>
-      <w:r>
-        <w:rPr>
-          <w:rFonts w:ascii="Cambria" w:hAnsi="Cambria"/>
-          <w:b/>
-          <w:bCs/>
-          <w:sz w:val="28"/>
-          <w:szCs w:val="28"/>
-        </w:rPr>
-        <w:t xml:space="preserve">№</w:t>
-      </w:r>
-      <w:r>
-        <w:rPr>
-          <w:rFonts w:ascii="Cambria" w:hAnsi="Cambria"/>
-          <w:b/>
-          <w:bCs/>
-          <w:sz w:val="28"/>
-          <w:szCs w:val="28"/>
-          <w:lang w:val="en-US"/>
-        </w:rPr>
-        <w:t xml:space="preserve">3.2</w:t>
-      </w:r>
-      <w:r>
-        <w:rPr>
-          <w:rFonts w:ascii="Cambria" w:hAnsi="Cambria"/>
-          <w:b/>
-          <w:bCs/>
-          <w:sz w:val="28"/>
-          <w:szCs w:val="28"/>
-          <w:highlight w:val="none"/>
-          <w:lang w:val="en-US"/>
-        </w:rPr>
-      </w:r>
-      <w:r>
-        <w:rPr>
-          <w:rFonts w:ascii="Cambria" w:hAnsi="Cambria"/>
-          <w:b/>
-          <w:bCs/>
-          <w:sz w:val="28"/>
-          <w:szCs w:val="28"/>
-          <w:highlight w:val="none"/>
-          <w:lang w:val="en-US"/>
-        </w:rPr>
-      </w:r>
-    </w:p>
-    <w:p>
-      <w:pPr>
-        <w:pBdr/>
-        <w:spacing w:line="360" w:lineRule="auto"/>
-        <w:ind w:right="0" w:firstLine="709" w:left="0"/>
-        <w:rPr>
-          <w:rFonts w:ascii="Times New Roman" w:hAnsi="Times New Roman" w:cs="Times New Roman"/>
-          <w:sz w:val="28"/>
-          <w:szCs w:val="28"/>
-        </w:rPr>
-      </w:pPr>
-      <w:r>
-        <w:rPr>
-          <w:rFonts w:ascii="Times New Roman" w:hAnsi="Times New Roman" w:cs="Times New Roman"/>
-          <w:sz w:val="28"/>
-          <w:szCs w:val="28"/>
-        </w:rPr>
-        <w:t xml:space="preserve">Нарисовать оператор цикла для выполнения действий</w:t>
-      </w:r>
-      <w:r>
-        <w:rPr>
-          <w:rFonts w:ascii="Times New Roman" w:hAnsi="Times New Roman" w:cs="Times New Roman"/>
-          <w:sz w:val="28"/>
-          <w:szCs w:val="28"/>
-          <w:lang w:val="en-US"/>
-        </w:rPr>
-        <w:t xml:space="preserve">.</w:t>
-      </w:r>
-      <w:r>
-        <w:rPr>
-          <w:rFonts w:ascii="Times New Roman" w:hAnsi="Times New Roman" w:cs="Times New Roman"/>
-          <w:sz w:val="28"/>
-          <w:szCs w:val="28"/>
-        </w:rPr>
-      </w:r>
-      <w:r>
-        <w:rPr>
-          <w:rFonts w:ascii="Times New Roman" w:hAnsi="Times New Roman" w:cs="Times New Roman"/>
-          <w:sz w:val="28"/>
-          <w:szCs w:val="28"/>
-        </w:rPr>
-      </w:r>
-    </w:p>
-    <w:p>
-      <w:pPr>
-        <w:pBdr/>
-        <w:spacing w:line="360" w:lineRule="auto"/>
-        <w:ind w:right="0" w:firstLine="709" w:left="0"/>
-        <w:rPr>
-          <w:rFonts w:ascii="Times New Roman" w:hAnsi="Times New Roman" w:cs="Times New Roman"/>
-          <w:sz w:val="28"/>
-          <w:szCs w:val="28"/>
-          <w:lang w:val="en-US"/>
-        </w:rPr>
-      </w:pPr>
-      <w:r>
-        <w:rPr>
-          <w:rFonts w:ascii="Times New Roman" w:hAnsi="Times New Roman" w:cs="Times New Roman"/>
-          <w:sz w:val="28"/>
-          <w:szCs w:val="28"/>
-          <w:highlight w:val="none"/>
-          <w:lang w:val="en-US" w:bidi="en-US"/>
-        </w:rPr>
-      </w:r>
-      <w:r>
-        <w:rPr>
-          <w:rFonts w:ascii="Cambria" w:hAnsi="Cambria"/>
-          <w:b/>
-          <w:bCs/>
-          <w:sz w:val="28"/>
-          <w:szCs w:val="28"/>
-        </w:rPr>
-        <w:t xml:space="preserve">Вариант</w:t>
-      </w:r>
-      <w:r>
-        <w:rPr>
-          <w:rFonts w:ascii="Cambria" w:hAnsi="Cambria"/>
-          <w:b/>
-          <w:bCs/>
-          <w:sz w:val="28"/>
-          <w:szCs w:val="28"/>
           <w:lang w:val="en-US"/>
         </w:rPr>
         <w:t xml:space="preserve"> 1,2,4,5</w:t>
@@ -12453,7 +11813,7 @@
           <w:sz w:val="28"/>
           <w:szCs w:val="28"/>
         </w:rPr>
-        <w:t xml:space="preserve">Вывода чисел от 5 до 10</w:t>
+        <w:t xml:space="preserve">Вывод чисел от 5 до 10</w:t>
       </w:r>
       <w:r>
         <w:rPr>
@@ -12498,7 +11858,7 @@
           <w:sz w:val="28"/>
           <w:szCs w:val="28"/>
         </w:rPr>
-        <w:t xml:space="preserve">Вывода чисел от 9 до 1</w:t>
+        <w:t xml:space="preserve">Вывод чисел от 9 до 1</w:t>
       </w:r>
       <w:r>
         <w:rPr>
@@ -12544,7 +11904,7 @@
           <w:sz w:val="28"/>
           <w:szCs w:val="28"/>
         </w:rPr>
-        <w:t xml:space="preserve">Вывода чисел 0 , -3, -6, -9, -12, -15</w:t>
+        <w:t xml:space="preserve">Вывод чисел 0 , -3, -6, -9, -12, -15</w:t>
       </w:r>
       <w:r>
         <w:rPr>
@@ -12588,7 +11948,7 @@
           <w:sz w:val="28"/>
           <w:szCs w:val="28"/>
         </w:rPr>
-        <w:t xml:space="preserve">Вывода четных чисел от 2 до 14</w:t>
+        <w:t xml:space="preserve">Вывод четных чисел от 2 до 14</w:t>
       </w:r>
       <w:r>
         <w:rPr>
@@ -12602,6 +11962,501 @@
           <w:rFonts w:ascii="Times New Roman" w:hAnsi="Times New Roman" w:cs="Times New Roman"/>
           <w:sz w:val="28"/>
           <w:szCs w:val="28"/>
+        </w:rPr>
+      </w:r>
+    </w:p>
+    <w:p>
+      <w:pPr>
+        <w:pBdr/>
+        <w:spacing w:line="360" w:lineRule="auto"/>
+        <w:ind w:right="0" w:firstLine="709" w:left="0"/>
+        <w:rPr>
+          <w:b/>
+          <w:bCs/>
+          <w:sz w:val="28"/>
+          <w:szCs w:val="28"/>
+          <w:highlight w:val="none"/>
+          <w:lang w:val="en-CA"/>
+        </w:rPr>
+      </w:pPr>
+      <w:r>
+        <w:rPr>
+          <w:b/>
+          <w:bCs/>
+          <w:sz w:val="28"/>
+          <w:szCs w:val="28"/>
+          <w:highlight w:val="none"/>
+          <w:lang w:val="en-CA"/>
+        </w:rPr>
+      </w:r>
+      <w:r>
+        <w:rPr>
+          <w:b/>
+          <w:bCs/>
+          <w:sz w:val="28"/>
+          <w:szCs w:val="28"/>
+          <w:highlight w:val="none"/>
+          <w:lang w:val="en-CA"/>
+        </w:rPr>
+      </w:r>
+      <w:r>
+        <w:rPr>
+          <w:b/>
+          <w:bCs/>
+          <w:sz w:val="28"/>
+          <w:szCs w:val="28"/>
+          <w:highlight w:val="none"/>
+          <w:lang w:val="en-CA"/>
+        </w:rPr>
+      </w:r>
+    </w:p>
+    <w:p>
+      <w:pPr>
+        <w:pBdr/>
+        <w:spacing w:line="360" w:lineRule="auto"/>
+        <w:ind w:right="0" w:firstLine="709" w:left="0"/>
+        <w:rPr>
+          <w:b/>
+          <w:bCs/>
+          <w:sz w:val="28"/>
+          <w:szCs w:val="28"/>
+          <w:highlight w:val="none"/>
+          <w:lang w:val="en-CA"/>
+        </w:rPr>
+      </w:pPr>
+      <w:r>
+        <w:rPr>
+          <w:b/>
+          <w:bCs/>
+          <w:sz w:val="28"/>
+          <w:szCs w:val="28"/>
+          <w:highlight w:val="none"/>
+          <w:lang w:val="en-CA"/>
+        </w:rPr>
+      </w:r>
+      <w:r>
+        <w:rPr>
+          <w:b/>
+          <w:bCs/>
+          <w:sz w:val="28"/>
+          <w:szCs w:val="28"/>
+          <w:highlight w:val="none"/>
+          <w:lang w:val="en-CA"/>
+        </w:rPr>
+      </w:r>
+      <w:r>
+        <w:rPr>
+          <w:b/>
+          <w:bCs/>
+          <w:sz w:val="28"/>
+          <w:szCs w:val="28"/>
+          <w:highlight w:val="none"/>
+          <w:lang w:val="en-CA"/>
+        </w:rPr>
+      </w:r>
+    </w:p>
+    <w:p>
+      <w:pPr>
+        <w:pBdr/>
+        <w:spacing w:line="360" w:lineRule="auto"/>
+        <w:ind w:right="0" w:firstLine="709" w:left="0"/>
+        <w:rPr>
+          <w:b/>
+          <w:bCs/>
+          <w:sz w:val="28"/>
+          <w:szCs w:val="28"/>
+          <w:highlight w:val="none"/>
+          <w:lang w:val="en-CA"/>
+        </w:rPr>
+      </w:pPr>
+      <w:r>
+        <w:rPr>
+          <w:b/>
+          <w:bCs/>
+          <w:sz w:val="28"/>
+          <w:szCs w:val="28"/>
+          <w:highlight w:val="none"/>
+          <w:lang w:val="en-CA"/>
+        </w:rPr>
+      </w:r>
+      <w:r>
+        <w:rPr>
+          <w:b/>
+          <w:bCs/>
+          <w:sz w:val="28"/>
+          <w:szCs w:val="28"/>
+          <w:highlight w:val="none"/>
+          <w:lang w:val="en-CA"/>
+        </w:rPr>
+      </w:r>
+      <w:r>
+        <w:rPr>
+          <w:b/>
+          <w:bCs/>
+          <w:sz w:val="28"/>
+          <w:szCs w:val="28"/>
+          <w:highlight w:val="none"/>
+          <w:lang w:val="en-CA"/>
+        </w:rPr>
+      </w:r>
+    </w:p>
+    <w:p>
+      <w:pPr>
+        <w:pBdr/>
+        <w:spacing w:line="360" w:lineRule="auto"/>
+        <w:ind w:right="0" w:firstLine="709" w:left="0"/>
+        <w:rPr>
+          <w:b/>
+          <w:bCs/>
+          <w:sz w:val="28"/>
+          <w:szCs w:val="28"/>
+          <w:highlight w:val="none"/>
+          <w:lang w:val="en-CA"/>
+        </w:rPr>
+      </w:pPr>
+      <w:r>
+        <w:rPr>
+          <w:b/>
+          <w:bCs/>
+          <w:sz w:val="28"/>
+          <w:szCs w:val="28"/>
+          <w:highlight w:val="none"/>
+          <w:lang w:val="en-CA"/>
+        </w:rPr>
+      </w:r>
+      <w:r>
+        <w:rPr>
+          <w:b/>
+          <w:bCs/>
+          <w:sz w:val="28"/>
+          <w:szCs w:val="28"/>
+          <w:highlight w:val="none"/>
+          <w:lang w:val="en-CA"/>
+        </w:rPr>
+      </w:r>
+      <w:r>
+        <w:rPr>
+          <w:b/>
+          <w:bCs/>
+          <w:sz w:val="28"/>
+          <w:szCs w:val="28"/>
+          <w:highlight w:val="none"/>
+          <w:lang w:val="en-CA"/>
+        </w:rPr>
+      </w:r>
+    </w:p>
+    <w:p>
+      <w:pPr>
+        <w:pBdr/>
+        <w:spacing w:line="360" w:lineRule="auto"/>
+        <w:ind w:right="0" w:firstLine="709" w:left="0"/>
+        <w:rPr>
+          <w:b/>
+          <w:bCs/>
+          <w:sz w:val="28"/>
+          <w:szCs w:val="28"/>
+          <w:highlight w:val="none"/>
+          <w:lang w:val="en-CA"/>
+        </w:rPr>
+      </w:pPr>
+      <w:r>
+        <w:rPr>
+          <w:b/>
+          <w:bCs/>
+          <w:sz w:val="28"/>
+          <w:szCs w:val="28"/>
+          <w:highlight w:val="none"/>
+          <w:lang w:val="en-CA"/>
+        </w:rPr>
+      </w:r>
+      <w:r>
+        <w:rPr>
+          <w:b/>
+          <w:bCs/>
+          <w:sz w:val="28"/>
+          <w:szCs w:val="28"/>
+          <w:highlight w:val="none"/>
+          <w:lang w:val="en-CA"/>
+        </w:rPr>
+      </w:r>
+      <w:r>
+        <w:rPr>
+          <w:b/>
+          <w:bCs/>
+          <w:sz w:val="28"/>
+          <w:szCs w:val="28"/>
+          <w:highlight w:val="none"/>
+          <w:lang w:val="en-CA"/>
+        </w:rPr>
+      </w:r>
+    </w:p>
+    <w:p>
+      <w:pPr>
+        <w:pBdr/>
+        <w:spacing w:line="360" w:lineRule="auto"/>
+        <w:ind w:right="0" w:firstLine="709" w:left="0"/>
+        <w:rPr>
+          <w:b/>
+          <w:bCs/>
+          <w:sz w:val="28"/>
+          <w:szCs w:val="28"/>
+          <w:highlight w:val="none"/>
+          <w:lang w:val="en-CA"/>
+        </w:rPr>
+      </w:pPr>
+      <w:r>
+        <w:rPr>
+          <w:b/>
+          <w:bCs/>
+          <w:sz w:val="28"/>
+          <w:szCs w:val="28"/>
+          <w:highlight w:val="none"/>
+          <w:lang w:val="en-CA"/>
+        </w:rPr>
+      </w:r>
+      <w:r>
+        <w:rPr>
+          <w:b/>
+          <w:bCs/>
+          <w:sz w:val="28"/>
+          <w:szCs w:val="28"/>
+          <w:highlight w:val="none"/>
+          <w:lang w:val="en-CA"/>
+        </w:rPr>
+      </w:r>
+      <w:r>
+        <w:rPr>
+          <w:b/>
+          <w:bCs/>
+          <w:sz w:val="28"/>
+          <w:szCs w:val="28"/>
+          <w:highlight w:val="none"/>
+          <w:lang w:val="en-CA"/>
+        </w:rPr>
+      </w:r>
+    </w:p>
+    <w:p>
+      <w:pPr>
+        <w:pBdr/>
+        <w:spacing w:line="360" w:lineRule="auto"/>
+        <w:ind w:right="0" w:firstLine="709" w:left="0"/>
+        <w:rPr>
+          <w:b/>
+          <w:bCs/>
+          <w:sz w:val="28"/>
+          <w:szCs w:val="28"/>
+          <w:highlight w:val="none"/>
+          <w:lang w:val="en-CA"/>
+        </w:rPr>
+      </w:pPr>
+      <w:r>
+        <w:rPr>
+          <w:b/>
+          <w:bCs/>
+          <w:sz w:val="28"/>
+          <w:szCs w:val="28"/>
+          <w:highlight w:val="none"/>
+          <w:lang w:val="en-CA"/>
+        </w:rPr>
+      </w:r>
+      <w:r>
+        <w:rPr>
+          <w:b/>
+          <w:bCs/>
+          <w:sz w:val="28"/>
+          <w:szCs w:val="28"/>
+          <w:highlight w:val="none"/>
+          <w:lang w:val="en-CA"/>
+        </w:rPr>
+      </w:r>
+      <w:r>
+        <w:rPr>
+          <w:b/>
+          <w:bCs/>
+          <w:sz w:val="28"/>
+          <w:szCs w:val="28"/>
+          <w:highlight w:val="none"/>
+          <w:lang w:val="en-CA"/>
+        </w:rPr>
+      </w:r>
+    </w:p>
+    <w:p>
+      <w:pPr>
+        <w:pBdr/>
+        <w:spacing w:line="360" w:lineRule="auto"/>
+        <w:ind w:right="0" w:firstLine="709" w:left="0"/>
+        <w:rPr>
+          <w:b/>
+          <w:bCs/>
+          <w:sz w:val="28"/>
+          <w:szCs w:val="28"/>
+          <w:highlight w:val="none"/>
+          <w:lang w:val="en-CA"/>
+        </w:rPr>
+      </w:pPr>
+      <w:r>
+        <w:rPr>
+          <w:b/>
+          <w:bCs/>
+          <w:sz w:val="28"/>
+          <w:szCs w:val="28"/>
+          <w:highlight w:val="none"/>
+          <w:lang w:val="en-CA"/>
+        </w:rPr>
+      </w:r>
+      <w:r>
+        <w:rPr>
+          <w:b/>
+          <w:bCs/>
+          <w:sz w:val="28"/>
+          <w:szCs w:val="28"/>
+          <w:highlight w:val="none"/>
+          <w:lang w:val="en-CA"/>
+        </w:rPr>
+      </w:r>
+      <w:r>
+        <w:rPr>
+          <w:b/>
+          <w:bCs/>
+          <w:sz w:val="28"/>
+          <w:szCs w:val="28"/>
+          <w:highlight w:val="none"/>
+          <w:lang w:val="en-CA"/>
+        </w:rPr>
+      </w:r>
+    </w:p>
+    <w:p>
+      <w:pPr>
+        <w:pBdr/>
+        <w:spacing w:line="360" w:lineRule="auto"/>
+        <w:ind w:right="0" w:firstLine="709" w:left="0"/>
+        <w:rPr>
+          <w:b/>
+          <w:bCs/>
+          <w:sz w:val="28"/>
+          <w:szCs w:val="28"/>
+          <w:highlight w:val="none"/>
+          <w:lang w:val="en-CA"/>
+        </w:rPr>
+      </w:pPr>
+      <w:r>
+        <w:rPr>
+          <w:b/>
+          <w:bCs/>
+          <w:sz w:val="28"/>
+          <w:szCs w:val="28"/>
+          <w:highlight w:val="none"/>
+          <w:lang w:val="en-CA"/>
+        </w:rPr>
+      </w:r>
+      <w:r>
+        <w:rPr>
+          <w:b/>
+          <w:bCs/>
+          <w:sz w:val="28"/>
+          <w:szCs w:val="28"/>
+          <w:highlight w:val="none"/>
+          <w:lang w:val="en-CA"/>
+        </w:rPr>
+      </w:r>
+      <w:r>
+        <w:rPr>
+          <w:b/>
+          <w:bCs/>
+          <w:sz w:val="28"/>
+          <w:szCs w:val="28"/>
+          <w:highlight w:val="none"/>
+          <w:lang w:val="en-CA"/>
+        </w:rPr>
+      </w:r>
+    </w:p>
+    <w:p>
+      <w:pPr>
+        <w:pBdr/>
+        <w:spacing w:line="360" w:lineRule="auto"/>
+        <w:ind w:right="0" w:firstLine="709" w:left="0"/>
+        <w:rPr>
+          <w:b/>
+          <w:bCs/>
+          <w:sz w:val="28"/>
+          <w:szCs w:val="28"/>
+          <w:highlight w:val="none"/>
+          <w:lang w:val="en-CA"/>
+        </w:rPr>
+      </w:pPr>
+      <w:r>
+        <w:rPr>
+          <w:b/>
+          <w:bCs/>
+          <w:sz w:val="28"/>
+          <w:szCs w:val="28"/>
+          <w:highlight w:val="none"/>
+          <w:lang w:val="en-CA"/>
+        </w:rPr>
+      </w:r>
+      <w:r>
+        <w:rPr>
+          <w:b/>
+          <w:bCs/>
+          <w:sz w:val="28"/>
+          <w:szCs w:val="28"/>
+          <w:highlight w:val="none"/>
+          <w:lang w:val="en-CA"/>
+        </w:rPr>
+      </w:r>
+      <w:r>
+        <w:rPr>
+          <w:b/>
+          <w:bCs/>
+          <w:sz w:val="28"/>
+          <w:szCs w:val="28"/>
+          <w:highlight w:val="none"/>
+          <w:lang w:val="en-CA"/>
+        </w:rPr>
+      </w:r>
+    </w:p>
+    <w:p>
+      <w:pPr>
+        <w:pBdr/>
+        <w:spacing w:line="360" w:lineRule="auto"/>
+        <w:ind w:right="0" w:firstLine="709" w:left="0"/>
+        <w:rPr>
+          <w:b/>
+          <w:bCs/>
+          <w:sz w:val="28"/>
+          <w:szCs w:val="28"/>
+          <w:highlight w:val="none"/>
+          <w:lang w:val="en-CA"/>
+        </w:rPr>
+      </w:pPr>
+      <w:r>
+        <w:rPr>
+          <w:b/>
+          <w:bCs/>
+          <w:sz w:val="28"/>
+          <w:szCs w:val="28"/>
+          <w:highlight w:val="none"/>
+          <w:lang w:val="en-CA"/>
+        </w:rPr>
+      </w:r>
+      <w:r>
+        <w:rPr>
+          <w:b/>
+          <w:bCs/>
+          <w:sz w:val="28"/>
+          <w:szCs w:val="28"/>
+          <w:highlight w:val="none"/>
+          <w:lang w:val="en-CA"/>
+        </w:rPr>
+      </w:r>
+      <w:r>
+        <w:rPr>
+          <w:b/>
+          <w:bCs/>
+          <w:sz w:val="28"/>
+          <w:szCs w:val="28"/>
+          <w:highlight w:val="none"/>
+          <w:lang w:val="en-CA"/>
         </w:rPr>
       </w:r>
     </w:p>
@@ -12702,7 +12557,7 @@
           <mc:Choice Requires="wpg">
             <w:drawing>
               <wp:inline xmlns:wp="http://schemas.openxmlformats.org/drawingml/2006/wordprocessingDrawing" distT="0" distB="0" distL="0" distR="0">
-                <wp:extent cx="5939790" cy="5524005"/>
+                <wp:extent cx="5939789" cy="5524004"/>
                 <wp:effectExtent l="0" t="0" r="0" b="0"/>
                 <wp:docPr id="8" name=""/>
                 <wp:cNvGraphicFramePr>
@@ -12776,28 +12631,6 @@
       </w:r>
       <w:r>
         <w:rPr>
-          <w:rFonts w:ascii="Times New Roman" w:hAnsi="Times New Roman" w:cs="Times New Roman"/>
-          <w:sz w:val="28"/>
-          <w:szCs w:val="28"/>
-          <w:lang w:val="en-US"/>
-        </w:rPr>
-      </w:r>
-    </w:p>
-    <w:p>
-      <w:pPr>
-        <w:pBdr/>
-        <w:spacing w:line="360" w:lineRule="auto"/>
-        <w:ind w:right="0" w:firstLine="709" w:left="0"/>
-        <w:rPr>
-          <w:rFonts w:ascii="Times New Roman" w:hAnsi="Times New Roman" w:cs="Times New Roman"/>
-          <w:sz w:val="28"/>
-          <w:szCs w:val="28"/>
-          <w:highlight w:val="none"/>
-          <w:lang w:val="en-US"/>
-        </w:rPr>
-      </w:pPr>
-      <w:r>
-        <w:rPr>
           <w:b/>
           <w:bCs/>
           <w:sz w:val="28"/>
@@ -12808,29 +12641,6 @@
       </w:r>
       <w:r>
         <w:rPr>
-          <w:rFonts w:ascii="Times New Roman" w:hAnsi="Times New Roman" w:cs="Times New Roman"/>
-          <w:sz w:val="28"/>
-          <w:szCs w:val="28"/>
-          <w:highlight w:val="none"/>
-          <w:lang w:val="en-US"/>
-        </w:rPr>
-      </w:r>
-      <w:r>
-        <w:rPr>
-          <w:rFonts w:ascii="Times New Roman" w:hAnsi="Times New Roman" w:cs="Times New Roman"/>
-          <w:sz w:val="28"/>
-          <w:szCs w:val="28"/>
-          <w:highlight w:val="none"/>
-          <w:lang w:val="en-US"/>
-        </w:rPr>
-      </w:r>
-    </w:p>
-    <w:p>
-      <w:pPr>
-        <w:pBdr/>
-        <w:spacing w:line="360" w:lineRule="auto"/>
-        <w:ind w:right="0" w:firstLine="709" w:left="0"/>
-        <w:rPr>
           <w:b/>
           <w:bCs/>
           <w:sz w:val="28"/>
@@ -12838,7 +12648,7 @@
           <w:highlight w:val="none"/>
           <w:lang w:val="en-CA"/>
         </w:rPr>
-      </w:pPr>
+      </w:r>
       <w:r>
         <w:rPr>
           <w:b/>
@@ -12851,67 +12661,10 @@
       </w:r>
       <w:r>
         <w:rPr>
-          <w:b/>
-          <w:bCs/>
-          <w:sz w:val="28"/>
-          <w:szCs w:val="28"/>
-          <w:highlight w:val="none"/>
-          <w:lang w:val="en-CA"/>
-        </w:rPr>
-      </w:r>
-      <w:r>
-        <w:rPr>
-          <w:b/>
-          <w:bCs/>
-          <w:sz w:val="28"/>
-          <w:szCs w:val="28"/>
-          <w:highlight w:val="none"/>
-          <w:lang w:val="en-CA"/>
-        </w:rPr>
-      </w:r>
-    </w:p>
-    <w:p>
-      <w:pPr>
-        <w:pBdr/>
-        <w:spacing w:line="360" w:lineRule="auto"/>
-        <w:ind w:right="0" w:firstLine="709" w:left="0"/>
-        <w:rPr>
-          <w:b/>
-          <w:bCs/>
-          <w:sz w:val="28"/>
-          <w:szCs w:val="28"/>
-          <w:highlight w:val="none"/>
-          <w:lang w:val="en-CA"/>
-        </w:rPr>
-      </w:pPr>
-      <w:r>
-        <w:rPr>
-          <w:b/>
-          <w:bCs/>
-          <w:sz w:val="28"/>
-          <w:szCs w:val="28"/>
-          <w:highlight w:val="none"/>
-          <w:lang w:val="en-CA"/>
-        </w:rPr>
-      </w:r>
-      <w:r>
-        <w:rPr>
-          <w:b/>
-          <w:bCs/>
-          <w:sz w:val="28"/>
-          <w:szCs w:val="28"/>
-          <w:highlight w:val="none"/>
-          <w:lang w:val="en-CA"/>
-        </w:rPr>
-      </w:r>
-      <w:r>
-        <w:rPr>
-          <w:b/>
-          <w:bCs/>
-          <w:sz w:val="28"/>
-          <w:szCs w:val="28"/>
-          <w:highlight w:val="none"/>
-          <w:lang w:val="en-CA"/>
+          <w:rFonts w:ascii="Times New Roman" w:hAnsi="Times New Roman" w:cs="Times New Roman"/>
+          <w:sz w:val="28"/>
+          <w:szCs w:val="28"/>
+          <w:lang w:val="en-US"/>
         </w:rPr>
       </w:r>
     </w:p>
@@ -14526,20 +14279,10 @@
       <w:r>
         <w:rPr>
           <w:rFonts w:ascii="Times New Roman" w:hAnsi="Times New Roman" w:cs="Times New Roman"/>
-          <w:b/>
-          <w:bCs/>
-          <w:sz w:val="28"/>
-          <w:szCs w:val="28"/>
-        </w:rPr>
-        <w:t xml:space="preserve">3 </w:t>
-      </w:r>
-      <w:r>
-        <w:rPr>
-          <w:rFonts w:ascii="Times New Roman" w:hAnsi="Times New Roman" w:cs="Times New Roman"/>
-          <w:sz w:val="28"/>
-          <w:szCs w:val="28"/>
-        </w:rPr>
-        <w:t xml:space="preserve">Ввода 7 чисел и накопления суммы положительных из них</w:t>
+          <w:sz w:val="28"/>
+          <w:szCs w:val="28"/>
+        </w:rPr>
+        <w:t xml:space="preserve">Ввод 7 чисел и накопления суммы положительных из них</w:t>
       </w:r>
       <w:r>
         <w:rPr>
@@ -15524,6 +15267,98 @@
           <w:bCs/>
           <w:sz w:val="28"/>
           <w:szCs w:val="28"/>
+          <w:highlight w:val="none"/>
+        </w:rPr>
+      </w:r>
+      <w:r>
+        <w:rPr>
+          <w:rFonts w:ascii="Cambria" w:hAnsi="Cambria"/>
+          <w:b/>
+          <w:bCs/>
+          <w:sz w:val="28"/>
+          <w:szCs w:val="28"/>
+          <w:highlight w:val="none"/>
+        </w:rPr>
+      </w:r>
+      <w:r>
+        <w:rPr>
+          <w:rFonts w:ascii="Cambria" w:hAnsi="Cambria"/>
+          <w:b/>
+          <w:bCs/>
+          <w:sz w:val="28"/>
+          <w:szCs w:val="28"/>
+          <w:highlight w:val="none"/>
+        </w:rPr>
+      </w:r>
+    </w:p>
+    <w:p>
+      <w:pPr>
+        <w:pBdr/>
+        <w:spacing w:before="240" w:line="360" w:lineRule="auto"/>
+        <w:ind w:right="0" w:firstLine="709" w:left="0"/>
+        <w:jc w:val="center"/>
+        <w:rPr>
+          <w:rFonts w:ascii="Cambria" w:hAnsi="Cambria"/>
+          <w:b/>
+          <w:bCs/>
+          <w:sz w:val="28"/>
+          <w:szCs w:val="28"/>
+          <w:highlight w:val="none"/>
+        </w:rPr>
+      </w:pPr>
+      <w:r>
+        <w:rPr>
+          <w:rFonts w:ascii="Cambria" w:hAnsi="Cambria"/>
+          <w:b/>
+          <w:bCs/>
+          <w:sz w:val="28"/>
+          <w:szCs w:val="28"/>
+          <w:highlight w:val="none"/>
+        </w:rPr>
+      </w:r>
+      <w:r>
+        <w:rPr>
+          <w:rFonts w:ascii="Cambria" w:hAnsi="Cambria"/>
+          <w:b/>
+          <w:bCs/>
+          <w:sz w:val="28"/>
+          <w:szCs w:val="28"/>
+          <w:highlight w:val="none"/>
+        </w:rPr>
+      </w:r>
+      <w:r>
+        <w:rPr>
+          <w:rFonts w:ascii="Cambria" w:hAnsi="Cambria"/>
+          <w:b/>
+          <w:bCs/>
+          <w:sz w:val="28"/>
+          <w:szCs w:val="28"/>
+          <w:highlight w:val="none"/>
+        </w:rPr>
+      </w:r>
+    </w:p>
+    <w:p>
+      <w:pPr>
+        <w:pBdr/>
+        <w:spacing w:before="240" w:line="360" w:lineRule="auto"/>
+        <w:ind w:right="0" w:firstLine="709" w:left="0"/>
+        <w:jc w:val="center"/>
+        <w:rPr>
+          <w:rFonts w:ascii="Cambria" w:hAnsi="Cambria"/>
+          <w:b/>
+          <w:bCs/>
+          <w:sz w:val="28"/>
+          <w:szCs w:val="28"/>
+          <w:highlight w:val="none"/>
+        </w:rPr>
+      </w:pPr>
+      <w:r>
+        <w:rPr>
+          <w:rFonts w:ascii="Cambria" w:hAnsi="Cambria"/>
+          <w:b/>
+          <w:bCs/>
+          <w:sz w:val="28"/>
+          <w:szCs w:val="28"/>
         </w:rPr>
         <w:t xml:space="preserve">Задание </w:t>
       </w:r>
@@ -15804,7 +15639,7 @@
           <mc:Choice Requires="wpg">
             <w:drawing>
               <wp:inline xmlns:wp="http://schemas.openxmlformats.org/drawingml/2006/wordprocessingDrawing" distT="0" distB="0" distL="0" distR="0">
-                <wp:extent cx="2381250" cy="3933825"/>
+                <wp:extent cx="2968650" cy="4904209"/>
                 <wp:effectExtent l="0" t="0" r="0" b="0"/>
                 <wp:docPr id="10" name=""/>
                 <wp:cNvGraphicFramePr>
@@ -15825,9 +15660,9 @@
                         <a:stretch/>
                       </pic:blipFill>
                       <pic:spPr bwMode="auto">
-                        <a:xfrm>
+                        <a:xfrm flipH="0" flipV="0">
                           <a:off x="0" y="0"/>
-                          <a:ext cx="2381249" cy="3933824"/>
+                          <a:ext cx="2968649" cy="4904209"/>
                         </a:xfrm>
                         <a:prstGeom prst="rect">
                           <a:avLst/>
@@ -15860,7 +15695,7 @@
                 <v:path o:extrusionok="f" gradientshapeok="t" o:connecttype="rect"/>
                 <o:lock v:ext="edit" aspectratio="t"/>
               </v:shapetype>
-              <v:shape id="_x0000_i9" o:spid="_x0000_s9" type="#_x0000_t75" style="width:187.50pt;height:309.75pt;mso-wrap-distance-left:0.00pt;mso-wrap-distance-top:0.00pt;mso-wrap-distance-right:0.00pt;mso-wrap-distance-bottom:0.00pt;z-index:1;" stroked="false">
+              <v:shape id="_x0000_i9" o:spid="_x0000_s9" type="#_x0000_t75" style="width:233.75pt;height:386.16pt;mso-wrap-distance-left:0.00pt;mso-wrap-distance-top:0.00pt;mso-wrap-distance-right:0.00pt;mso-wrap-distance-bottom:0.00pt;z-index:1;" stroked="false">
                 <v:imagedata r:id="rId21" o:title=""/>
                 <o:lock v:ext="edit" rotation="t"/>
               </v:shape>
@@ -16165,7 +16000,7 @@
     <w:p>
       <w:pPr>
         <w:pBdr/>
-        <w:spacing w:line="360" w:lineRule="auto"/>
+        <w:spacing w:before="240" w:line="360" w:lineRule="auto"/>
         <w:ind w:right="0" w:firstLine="709" w:left="0"/>
         <w:rPr>
           <w:rFonts w:ascii="Cambria" w:hAnsi="Cambria"/>
@@ -16179,22 +16014,14 @@
       </w:pPr>
       <w:r>
         <w:rPr>
-          <w:rFonts w:ascii="Times New Roman" w:hAnsi="Times New Roman" w:cs="Times New Roman"/>
-          <w:sz w:val="28"/>
-          <w:szCs w:val="28"/>
-          <w:highlight w:val="none"/>
-          <w:lang w:val="en-US" w:bidi="en-US"/>
-        </w:rPr>
-      </w:r>
-      <w:r>
-        <w:rPr>
           <w:rFonts w:ascii="Cambria" w:hAnsi="Cambria"/>
           <w:b/>
           <w:bCs/>
           <w:sz w:val="28"/>
           <w:szCs w:val="28"/>
-        </w:rPr>
-        <w:t xml:space="preserve">Вариант </w:t>
+          <w:highlight w:val="none"/>
+          <w:lang w:val="en-US"/>
+        </w:rPr>
       </w:r>
       <w:r>
         <w:rPr>
@@ -16203,9 +16030,9 @@
           <w:bCs/>
           <w:sz w:val="28"/>
           <w:szCs w:val="28"/>
+          <w:highlight w:val="none"/>
           <w:lang w:val="en-US"/>
         </w:rPr>
-        <w:t xml:space="preserve">2</w:t>
       </w:r>
       <w:r>
         <w:rPr>
@@ -16218,7 +16045,12 @@
           <w:lang w:val="en-US"/>
         </w:rPr>
       </w:r>
-      <w:r>
+    </w:p>
+    <w:p>
+      <w:pPr>
+        <w:pBdr/>
+        <w:spacing w:before="240" w:line="360" w:lineRule="auto"/>
+        <w:ind w:right="0" w:firstLine="709" w:left="0"/>
         <w:rPr>
           <w:rFonts w:ascii="Cambria" w:hAnsi="Cambria"/>
           <w:b/>
@@ -16228,11 +16060,112 @@
           <w:highlight w:val="none"/>
           <w:lang w:val="en-US"/>
         </w:rPr>
+      </w:pPr>
+      <w:r>
+        <w:rPr>
+          <w:rFonts w:ascii="Cambria" w:hAnsi="Cambria"/>
+          <w:b/>
+          <w:bCs/>
+          <w:sz w:val="28"/>
+          <w:szCs w:val="28"/>
+          <w:highlight w:val="none"/>
+          <w:lang w:val="en-US"/>
+        </w:rPr>
+      </w:r>
+      <w:r>
+        <w:rPr>
+          <w:rFonts w:ascii="Cambria" w:hAnsi="Cambria"/>
+          <w:b/>
+          <w:bCs/>
+          <w:sz w:val="28"/>
+          <w:szCs w:val="28"/>
+          <w:highlight w:val="none"/>
+          <w:lang w:val="en-US"/>
+        </w:rPr>
+      </w:r>
+      <w:r>
+        <w:rPr>
+          <w:rFonts w:ascii="Cambria" w:hAnsi="Cambria"/>
+          <w:b/>
+          <w:bCs/>
+          <w:sz w:val="28"/>
+          <w:szCs w:val="28"/>
+          <w:highlight w:val="none"/>
+          <w:lang w:val="en-US"/>
+        </w:rPr>
       </w:r>
     </w:p>
     <w:p>
       <w:pPr>
         <w:pBdr/>
+        <w:spacing w:before="240" w:line="360" w:lineRule="auto"/>
+        <w:ind w:right="0" w:firstLine="709" w:left="0"/>
+        <w:rPr>
+          <w:rFonts w:ascii="Cambria" w:hAnsi="Cambria"/>
+          <w:b/>
+          <w:bCs/>
+          <w:sz w:val="28"/>
+          <w:szCs w:val="28"/>
+          <w:highlight w:val="none"/>
+          <w:lang w:val="en-US"/>
+        </w:rPr>
+      </w:pPr>
+      <w:r>
+        <w:rPr>
+          <w:rFonts w:ascii="Times New Roman" w:hAnsi="Times New Roman" w:cs="Times New Roman"/>
+          <w:sz w:val="28"/>
+          <w:szCs w:val="28"/>
+          <w:highlight w:val="none"/>
+          <w:lang w:val="en-US" w:bidi="en-US"/>
+        </w:rPr>
+      </w:r>
+      <w:r>
+        <w:rPr>
+          <w:rFonts w:ascii="Cambria" w:hAnsi="Cambria"/>
+          <w:b/>
+          <w:bCs/>
+          <w:sz w:val="28"/>
+          <w:szCs w:val="28"/>
+        </w:rPr>
+        <w:t xml:space="preserve">Вариант </w:t>
+      </w:r>
+      <w:r>
+        <w:rPr>
+          <w:rFonts w:ascii="Cambria" w:hAnsi="Cambria"/>
+          <w:b/>
+          <w:bCs/>
+          <w:sz w:val="28"/>
+          <w:szCs w:val="28"/>
+          <w:lang w:val="en-US"/>
+        </w:rPr>
+        <w:t xml:space="preserve">2</w:t>
+      </w:r>
+      <w:r>
+        <w:rPr>
+          <w:rFonts w:ascii="Cambria" w:hAnsi="Cambria"/>
+          <w:b/>
+          <w:bCs/>
+          <w:sz w:val="28"/>
+          <w:szCs w:val="28"/>
+          <w:highlight w:val="none"/>
+          <w:lang w:val="en-US"/>
+        </w:rPr>
+      </w:r>
+      <w:r>
+        <w:rPr>
+          <w:rFonts w:ascii="Cambria" w:hAnsi="Cambria"/>
+          <w:b/>
+          <w:bCs/>
+          <w:sz w:val="28"/>
+          <w:szCs w:val="28"/>
+          <w:highlight w:val="none"/>
+          <w:lang w:val="en-US"/>
+        </w:rPr>
+      </w:r>
+    </w:p>
+    <w:p>
+      <w:pPr>
+        <w:pBdr/>
         <w:spacing w:line="360" w:lineRule="auto"/>
         <w:ind w:right="0" w:firstLine="709" w:left="0"/>
         <w:rPr>
@@ -16263,6 +16196,80 @@
           <w:szCs w:val="28"/>
         </w:rPr>
       </w:r>
+      <w:r>
+        <w:rPr>
+          <w:b/>
+          <w:bCs/>
+          <w:sz w:val="28"/>
+          <w:szCs w:val="28"/>
+          <w:highlight w:val="none"/>
+          <w:lang w:val="en-CA"/>
+        </w:rPr>
+      </w:r>
+      <w:r>
+        <w:rPr>
+          <w:b/>
+          <w:bCs/>
+          <w:sz w:val="28"/>
+          <w:szCs w:val="28"/>
+          <w:highlight w:val="none"/>
+          <w:lang w:val="en-CA"/>
+        </w:rPr>
+      </w:r>
+      <w:r>
+        <w:rPr>
+          <w:b/>
+          <w:bCs/>
+          <w:sz w:val="28"/>
+          <w:szCs w:val="28"/>
+          <w:highlight w:val="none"/>
+          <w:lang w:val="en-CA"/>
+        </w:rPr>
+      </w:r>
+      <w:r>
+        <w:rPr>
+          <w:rFonts w:ascii="Times New Roman" w:hAnsi="Times New Roman" w:cs="Times New Roman"/>
+          <w:sz w:val="28"/>
+          <w:szCs w:val="28"/>
+        </w:rPr>
+      </w:r>
+      <w:r>
+        <w:rPr>
+          <w:b/>
+          <w:bCs/>
+          <w:sz w:val="28"/>
+          <w:szCs w:val="28"/>
+          <w:highlight w:val="none"/>
+          <w:lang w:val="en-CA"/>
+        </w:rPr>
+      </w:r>
+      <w:r>
+        <w:rPr>
+          <w:b/>
+          <w:bCs/>
+          <w:sz w:val="28"/>
+          <w:szCs w:val="28"/>
+          <w:highlight w:val="none"/>
+          <w:lang w:val="en-CA"/>
+        </w:rPr>
+      </w:r>
+      <w:r>
+        <w:rPr>
+          <w:b/>
+          <w:bCs/>
+          <w:sz w:val="28"/>
+          <w:szCs w:val="28"/>
+          <w:highlight w:val="none"/>
+          <w:lang w:val="en-CA"/>
+        </w:rPr>
+      </w:r>
+      <w:r>
+        <w:rPr>
+          <w:rFonts w:ascii="Times New Roman" w:hAnsi="Times New Roman" w:cs="Times New Roman"/>
+          <w:sz w:val="28"/>
+          <w:szCs w:val="28"/>
+        </w:rPr>
+      </w:r>
     </w:p>
     <w:p>
       <w:pPr>
@@ -16270,10 +16277,12 @@
         <w:spacing w:line="360" w:lineRule="auto"/>
         <w:ind w:right="0" w:firstLine="709" w:left="0"/>
         <w:rPr>
-          <w:rFonts w:ascii="Times New Roman" w:hAnsi="Times New Roman" w:cs="Times New Roman"/>
-          <w:sz w:val="28"/>
-          <w:szCs w:val="28"/>
-          <w:lang w:val="en-US"/>
+          <w:b/>
+          <w:bCs/>
+          <w:sz w:val="28"/>
+          <w:szCs w:val="28"/>
+          <w:highlight w:val="none"/>
+          <w:lang w:val="en-CA"/>
         </w:rPr>
       </w:pPr>
       <w:r>
@@ -16356,7 +16365,7 @@
           <mc:Choice Requires="wpg">
             <w:drawing>
               <wp:inline xmlns:wp="http://schemas.openxmlformats.org/drawingml/2006/wordprocessingDrawing" distT="0" distB="0" distL="0" distR="0">
-                <wp:extent cx="4048125" cy="3933825"/>
+                <wp:extent cx="4507812" cy="4380532"/>
                 <wp:effectExtent l="0" t="0" r="0" b="0"/>
                 <wp:docPr id="11" name=""/>
                 <wp:cNvGraphicFramePr>
@@ -16366,7 +16375,7 @@
                   <a:graphicData uri="http://schemas.openxmlformats.org/drawingml/2006/picture">
                     <pic:pic xmlns:pic="http://schemas.openxmlformats.org/drawingml/2006/picture">
                       <pic:nvPicPr>
-                        <pic:cNvPr id="848342844" name=""/>
+                        <pic:cNvPr id="796529054" name=""/>
                         <pic:cNvPicPr>
                           <a:picLocks noChangeAspect="1"/>
                         </pic:cNvPicPr>
@@ -16377,9 +16386,9 @@
                         <a:stretch/>
                       </pic:blipFill>
                       <pic:spPr bwMode="auto">
-                        <a:xfrm>
+                        <a:xfrm flipH="0" flipV="0">
                           <a:off x="0" y="0"/>
-                          <a:ext cx="4048124" cy="3933824"/>
+                          <a:ext cx="4507811" cy="4380532"/>
                         </a:xfrm>
                         <a:prstGeom prst="rect">
                           <a:avLst/>
@@ -16412,13 +16421,33 @@
                 <v:path o:extrusionok="f" gradientshapeok="t" o:connecttype="rect"/>
                 <o:lock v:ext="edit" aspectratio="t"/>
               </v:shapetype>
-              <v:shape id="_x0000_i10" o:spid="_x0000_s10" type="#_x0000_t75" style="width:318.75pt;height:309.75pt;mso-wrap-distance-left:0.00pt;mso-wrap-distance-top:0.00pt;mso-wrap-distance-right:0.00pt;mso-wrap-distance-bottom:0.00pt;z-index:1;" stroked="false">
+              <v:shape id="_x0000_i10" o:spid="_x0000_s10" type="#_x0000_t75" style="width:354.95pt;height:344.92pt;mso-wrap-distance-left:0.00pt;mso-wrap-distance-top:0.00pt;mso-wrap-distance-right:0.00pt;mso-wrap-distance-bottom:0.00pt;z-index:1;" stroked="false">
                 <v:imagedata r:id="rId22" o:title=""/>
                 <o:lock v:ext="edit" rotation="t"/>
               </v:shape>
             </w:pict>
           </mc:Fallback>
         </mc:AlternateContent>
+      </w:r>
+      <w:r>
+        <w:rPr>
+          <w:b/>
+          <w:bCs/>
+          <w:sz w:val="28"/>
+          <w:szCs w:val="28"/>
+          <w:highlight w:val="none"/>
+          <w:lang w:val="en-CA"/>
+        </w:rPr>
+      </w:r>
+      <w:r>
+        <w:rPr>
+          <w:b/>
+          <w:bCs/>
+          <w:sz w:val="28"/>
+          <w:szCs w:val="28"/>
+          <w:highlight w:val="none"/>
+          <w:lang w:val="en-CA"/>
+        </w:rPr>
       </w:r>
       <w:r>
         <w:rPr>
@@ -16784,12 +16813,18 @@
         <w:t xml:space="preserve">)</w:t>
       </w:r>
       <w:r/>
-    </w:p>
-    <w:p>
-      <w:pPr>
-        <w:pBdr/>
-        <w:spacing w:line="360" w:lineRule="auto"/>
-        <w:ind w:right="0" w:firstLine="709" w:left="0"/>
+      <w:r>
+        <w:rPr>
+          <w:rFonts w:ascii="Cambria" w:hAnsi="Cambria"/>
+          <w:b/>
+          <w:bCs/>
+          <w:sz w:val="28"/>
+          <w:szCs w:val="28"/>
+          <w:highlight w:val="none"/>
+          <w:lang w:val="en-US"/>
+        </w:rPr>
+      </w:r>
+      <w:r>
         <w:rPr>
           <w:rFonts w:ascii="Times New Roman" w:hAnsi="Times New Roman" w:cs="Times New Roman"/>
           <w:b w:val="0"/>
@@ -16797,8 +16832,23 @@
           <w:sz w:val="28"/>
           <w:szCs w:val="28"/>
         </w:rPr>
-      </w:pPr>
-      <w:r>
+      </w:r>
+      <w:r>
+        <w:rPr>
+          <w:rFonts w:ascii="Times New Roman" w:hAnsi="Times New Roman" w:cs="Times New Roman"/>
+          <w:b w:val="0"/>
+          <w:bCs w:val="0"/>
+          <w:sz w:val="28"/>
+          <w:szCs w:val="28"/>
+        </w:rPr>
+      </w:r>
+      <w:r/>
+    </w:p>
+    <w:p>
+      <w:pPr>
+        <w:pBdr/>
+        <w:spacing w:before="240" w:line="360" w:lineRule="auto"/>
+        <w:ind w:right="0" w:firstLine="709" w:left="0"/>
         <w:rPr>
           <w:rFonts w:ascii="Cambria" w:hAnsi="Cambria"/>
           <w:b/>
@@ -16808,31 +16858,8 @@
           <w:highlight w:val="none"/>
           <w:lang w:val="en-US"/>
         </w:rPr>
-      </w:r>
-      <w:r>
-        <w:rPr>
-          <w:rFonts w:ascii="Times New Roman" w:hAnsi="Times New Roman" w:cs="Times New Roman"/>
-          <w:b w:val="0"/>
-          <w:bCs w:val="0"/>
-          <w:sz w:val="28"/>
-          <w:szCs w:val="28"/>
-        </w:rPr>
-      </w:r>
-      <w:r>
-        <w:rPr>
-          <w:rFonts w:ascii="Times New Roman" w:hAnsi="Times New Roman" w:cs="Times New Roman"/>
-          <w:b w:val="0"/>
-          <w:bCs w:val="0"/>
-          <w:sz w:val="28"/>
-          <w:szCs w:val="28"/>
-        </w:rPr>
-      </w:r>
-    </w:p>
-    <w:p>
-      <w:pPr>
-        <w:pBdr/>
-        <w:spacing w:line="360" w:lineRule="auto"/>
-        <w:ind w:right="0" w:firstLine="709" w:left="0"/>
+      </w:pPr>
+      <w:r>
         <w:rPr>
           <w:rFonts w:ascii="Cambria" w:hAnsi="Cambria"/>
           <w:b/>
@@ -16842,7 +16869,7 @@
           <w:highlight w:val="none"/>
           <w:lang w:val="en-US"/>
         </w:rPr>
-      </w:pPr>
+      </w:r>
       <w:r>
         <w:rPr>
           <w:rFonts w:ascii="Cambria" w:hAnsi="Cambria"/>
@@ -16865,7 +16892,12 @@
           <w:lang w:val="en-US"/>
         </w:rPr>
       </w:r>
-      <w:r>
+    </w:p>
+    <w:p>
+      <w:pPr>
+        <w:pBdr/>
+        <w:spacing w:before="240" w:line="360" w:lineRule="auto"/>
+        <w:ind w:right="0" w:firstLine="709" w:left="0"/>
         <w:rPr>
           <w:rFonts w:ascii="Cambria" w:hAnsi="Cambria"/>
           <w:b/>
@@ -16875,13 +16907,8 @@
           <w:highlight w:val="none"/>
           <w:lang w:val="en-US"/>
         </w:rPr>
-      </w:r>
-    </w:p>
-    <w:p>
-      <w:pPr>
-        <w:pBdr/>
-        <w:spacing w:line="360" w:lineRule="auto"/>
-        <w:ind w:right="0" w:firstLine="709" w:left="0"/>
+      </w:pPr>
+      <w:r>
         <w:rPr>
           <w:rFonts w:ascii="Cambria" w:hAnsi="Cambria"/>
           <w:b/>
@@ -16891,7 +16918,7 @@
           <w:highlight w:val="none"/>
           <w:lang w:val="en-US"/>
         </w:rPr>
-      </w:pPr>
+      </w:r>
       <w:r>
         <w:rPr>
           <w:rFonts w:ascii="Cambria" w:hAnsi="Cambria"/>
@@ -16914,7 +16941,12 @@
           <w:lang w:val="en-US"/>
         </w:rPr>
       </w:r>
-      <w:r>
+    </w:p>
+    <w:p>
+      <w:pPr>
+        <w:pBdr/>
+        <w:spacing w:before="240" w:line="360" w:lineRule="auto"/>
+        <w:ind w:right="0" w:firstLine="709" w:left="0"/>
         <w:rPr>
           <w:rFonts w:ascii="Cambria" w:hAnsi="Cambria"/>
           <w:b/>
@@ -16924,13 +16956,8 @@
           <w:highlight w:val="none"/>
           <w:lang w:val="en-US"/>
         </w:rPr>
-      </w:r>
-    </w:p>
-    <w:p>
-      <w:pPr>
-        <w:pBdr/>
-        <w:spacing w:line="360" w:lineRule="auto"/>
-        <w:ind w:right="0" w:firstLine="709" w:left="0"/>
+      </w:pPr>
+      <w:r>
         <w:rPr>
           <w:rFonts w:ascii="Cambria" w:hAnsi="Cambria"/>
           <w:b/>
@@ -16940,7 +16967,7 @@
           <w:highlight w:val="none"/>
           <w:lang w:val="en-US"/>
         </w:rPr>
-      </w:pPr>
+      </w:r>
       <w:r>
         <w:rPr>
           <w:rFonts w:ascii="Cambria" w:hAnsi="Cambria"/>
@@ -16963,7 +16990,12 @@
           <w:lang w:val="en-US"/>
         </w:rPr>
       </w:r>
-      <w:r>
+    </w:p>
+    <w:p>
+      <w:pPr>
+        <w:pBdr/>
+        <w:spacing w:before="240" w:line="360" w:lineRule="auto"/>
+        <w:ind w:right="0" w:firstLine="709" w:left="0"/>
         <w:rPr>
           <w:rFonts w:ascii="Cambria" w:hAnsi="Cambria"/>
           <w:b/>
@@ -16973,13 +17005,8 @@
           <w:highlight w:val="none"/>
           <w:lang w:val="en-US"/>
         </w:rPr>
-      </w:r>
-    </w:p>
-    <w:p>
-      <w:pPr>
-        <w:pBdr/>
-        <w:spacing w:line="360" w:lineRule="auto"/>
-        <w:ind w:right="0" w:firstLine="709" w:left="0"/>
+      </w:pPr>
+      <w:r>
         <w:rPr>
           <w:rFonts w:ascii="Cambria" w:hAnsi="Cambria"/>
           <w:b/>
@@ -16989,7 +17016,7 @@
           <w:highlight w:val="none"/>
           <w:lang w:val="en-US"/>
         </w:rPr>
-      </w:pPr>
+      </w:r>
       <w:r>
         <w:rPr>
           <w:rFonts w:ascii="Cambria" w:hAnsi="Cambria"/>
@@ -17012,169 +17039,11 @@
           <w:lang w:val="en-US"/>
         </w:rPr>
       </w:r>
-      <w:r>
-        <w:rPr>
-          <w:rFonts w:ascii="Cambria" w:hAnsi="Cambria"/>
-          <w:b/>
-          <w:bCs/>
-          <w:sz w:val="28"/>
-          <w:szCs w:val="28"/>
-          <w:highlight w:val="none"/>
-          <w:lang w:val="en-US"/>
-        </w:rPr>
-      </w:r>
     </w:p>
     <w:p>
       <w:pPr>
         <w:pBdr/>
-        <w:spacing w:line="360" w:lineRule="auto"/>
-        <w:ind w:right="0" w:firstLine="709" w:left="0"/>
-        <w:rPr>
-          <w:rFonts w:ascii="Cambria" w:hAnsi="Cambria"/>
-          <w:b/>
-          <w:bCs/>
-          <w:sz w:val="28"/>
-          <w:szCs w:val="28"/>
-          <w:highlight w:val="none"/>
-          <w:lang w:val="en-US"/>
-        </w:rPr>
-      </w:pPr>
-      <w:r>
-        <w:rPr>
-          <w:rFonts w:ascii="Cambria" w:hAnsi="Cambria"/>
-          <w:b/>
-          <w:bCs/>
-          <w:sz w:val="28"/>
-          <w:szCs w:val="28"/>
-          <w:highlight w:val="none"/>
-          <w:lang w:val="en-US"/>
-        </w:rPr>
-      </w:r>
-      <w:r>
-        <w:rPr>
-          <w:rFonts w:ascii="Cambria" w:hAnsi="Cambria"/>
-          <w:b/>
-          <w:bCs/>
-          <w:sz w:val="28"/>
-          <w:szCs w:val="28"/>
-          <w:highlight w:val="none"/>
-          <w:lang w:val="en-US"/>
-        </w:rPr>
-      </w:r>
-      <w:r>
-        <w:rPr>
-          <w:rFonts w:ascii="Cambria" w:hAnsi="Cambria"/>
-          <w:b/>
-          <w:bCs/>
-          <w:sz w:val="28"/>
-          <w:szCs w:val="28"/>
-          <w:highlight w:val="none"/>
-          <w:lang w:val="en-US"/>
-        </w:rPr>
-      </w:r>
-    </w:p>
-    <w:p>
-      <w:pPr>
-        <w:pBdr/>
-        <w:spacing w:line="360" w:lineRule="auto"/>
-        <w:ind w:right="0" w:firstLine="709" w:left="0"/>
-        <w:rPr>
-          <w:rFonts w:ascii="Cambria" w:hAnsi="Cambria"/>
-          <w:b/>
-          <w:bCs/>
-          <w:sz w:val="28"/>
-          <w:szCs w:val="28"/>
-          <w:highlight w:val="none"/>
-          <w:lang w:val="en-US"/>
-        </w:rPr>
-      </w:pPr>
-      <w:r>
-        <w:rPr>
-          <w:rFonts w:ascii="Cambria" w:hAnsi="Cambria"/>
-          <w:b/>
-          <w:bCs/>
-          <w:sz w:val="28"/>
-          <w:szCs w:val="28"/>
-          <w:highlight w:val="none"/>
-          <w:lang w:val="en-US"/>
-        </w:rPr>
-      </w:r>
-      <w:r>
-        <w:rPr>
-          <w:rFonts w:ascii="Cambria" w:hAnsi="Cambria"/>
-          <w:b/>
-          <w:bCs/>
-          <w:sz w:val="28"/>
-          <w:szCs w:val="28"/>
-          <w:highlight w:val="none"/>
-          <w:lang w:val="en-US"/>
-        </w:rPr>
-      </w:r>
-      <w:r>
-        <w:rPr>
-          <w:rFonts w:ascii="Cambria" w:hAnsi="Cambria"/>
-          <w:b/>
-          <w:bCs/>
-          <w:sz w:val="28"/>
-          <w:szCs w:val="28"/>
-          <w:highlight w:val="none"/>
-          <w:lang w:val="en-US"/>
-        </w:rPr>
-      </w:r>
-    </w:p>
-    <w:p>
-      <w:pPr>
-        <w:pBdr/>
-        <w:spacing w:line="360" w:lineRule="auto"/>
-        <w:ind w:right="0" w:firstLine="709" w:left="0"/>
-        <w:rPr>
-          <w:rFonts w:ascii="Cambria" w:hAnsi="Cambria"/>
-          <w:b/>
-          <w:bCs/>
-          <w:sz w:val="28"/>
-          <w:szCs w:val="28"/>
-          <w:highlight w:val="none"/>
-          <w:lang w:val="en-US"/>
-        </w:rPr>
-      </w:pPr>
-      <w:r>
-        <w:rPr>
-          <w:rFonts w:ascii="Cambria" w:hAnsi="Cambria"/>
-          <w:b/>
-          <w:bCs/>
-          <w:sz w:val="28"/>
-          <w:szCs w:val="28"/>
-          <w:highlight w:val="none"/>
-          <w:lang w:val="en-US"/>
-        </w:rPr>
-      </w:r>
-      <w:r>
-        <w:rPr>
-          <w:rFonts w:ascii="Cambria" w:hAnsi="Cambria"/>
-          <w:b/>
-          <w:bCs/>
-          <w:sz w:val="28"/>
-          <w:szCs w:val="28"/>
-          <w:highlight w:val="none"/>
-          <w:lang w:val="en-US"/>
-        </w:rPr>
-      </w:r>
-      <w:r>
-        <w:rPr>
-          <w:rFonts w:ascii="Cambria" w:hAnsi="Cambria"/>
-          <w:b/>
-          <w:bCs/>
-          <w:sz w:val="28"/>
-          <w:szCs w:val="28"/>
-          <w:highlight w:val="none"/>
-          <w:lang w:val="en-US"/>
-        </w:rPr>
-      </w:r>
-    </w:p>
-    <w:p>
-      <w:pPr>
-        <w:pBdr/>
-        <w:spacing w:line="360" w:lineRule="auto"/>
+        <w:spacing w:before="240" w:line="360" w:lineRule="auto"/>
         <w:ind w:right="0" w:firstLine="709" w:left="0"/>
         <w:rPr>
           <w:rFonts w:ascii="Cambria" w:hAnsi="Cambria"/>
@@ -17355,7 +17224,7 @@
           <mc:Choice Requires="wpg">
             <w:drawing>
               <wp:inline xmlns:wp="http://schemas.openxmlformats.org/drawingml/2006/wordprocessingDrawing" distT="0" distB="0" distL="0" distR="0">
-                <wp:extent cx="4066806" cy="5984015"/>
+                <wp:extent cx="4026983" cy="5925419"/>
                 <wp:effectExtent l="0" t="0" r="0" b="0"/>
                 <wp:docPr id="12" name=""/>
                 <wp:cNvGraphicFramePr>
@@ -17378,7 +17247,7 @@
                       <pic:spPr bwMode="auto">
                         <a:xfrm flipH="0" flipV="0">
                           <a:off x="0" y="0"/>
-                          <a:ext cx="4066805" cy="5984014"/>
+                          <a:ext cx="4026983" cy="5925418"/>
                         </a:xfrm>
                         <a:prstGeom prst="rect">
                           <a:avLst/>
@@ -17411,7 +17280,7 @@
                 <v:path o:extrusionok="f" gradientshapeok="t" o:connecttype="rect"/>
                 <o:lock v:ext="edit" aspectratio="t"/>
               </v:shapetype>
-              <v:shape id="_x0000_i11" o:spid="_x0000_s11" type="#_x0000_t75" style="width:320.22pt;height:471.18pt;mso-wrap-distance-left:0.00pt;mso-wrap-distance-top:0.00pt;mso-wrap-distance-right:0.00pt;mso-wrap-distance-bottom:0.00pt;z-index:1;" stroked="false">
+              <v:shape id="_x0000_i11" o:spid="_x0000_s11" type="#_x0000_t75" style="width:317.09pt;height:466.57pt;mso-wrap-distance-left:0.00pt;mso-wrap-distance-top:0.00pt;mso-wrap-distance-right:0.00pt;mso-wrap-distance-bottom:0.00pt;z-index:1;" stroked="false">
                 <v:imagedata r:id="rId23" o:title=""/>
                 <o:lock v:ext="edit" rotation="t"/>
               </v:shape>
@@ -18458,7 +18327,7 @@
           <mc:Choice Requires="wpg">
             <w:drawing>
               <wp:inline xmlns:wp="http://schemas.openxmlformats.org/drawingml/2006/wordprocessingDrawing" distT="0" distB="0" distL="0" distR="0">
-                <wp:extent cx="5364587" cy="5772762"/>
+                <wp:extent cx="5012706" cy="5394108"/>
                 <wp:effectExtent l="0" t="0" r="0" b="0"/>
                 <wp:docPr id="13" name=""/>
                 <wp:cNvGraphicFramePr>
@@ -18481,7 +18350,7 @@
                       <pic:spPr bwMode="auto">
                         <a:xfrm flipH="0" flipV="0">
                           <a:off x="0" y="0"/>
-                          <a:ext cx="5364587" cy="5772762"/>
+                          <a:ext cx="5012706" cy="5394107"/>
                         </a:xfrm>
                         <a:prstGeom prst="rect">
                           <a:avLst/>
@@ -18514,7 +18383,7 @@
                 <v:path o:extrusionok="f" gradientshapeok="t" o:connecttype="rect"/>
                 <o:lock v:ext="edit" aspectratio="t"/>
               </v:shapetype>
-              <v:shape id="_x0000_i12" o:spid="_x0000_s12" type="#_x0000_t75" style="width:422.41pt;height:454.55pt;mso-wrap-distance-left:0.00pt;mso-wrap-distance-top:0.00pt;mso-wrap-distance-right:0.00pt;mso-wrap-distance-bottom:0.00pt;z-index:1;" stroked="false">
+              <v:shape id="_x0000_i12" o:spid="_x0000_s12" type="#_x0000_t75" style="width:394.70pt;height:424.73pt;mso-wrap-distance-left:0.00pt;mso-wrap-distance-top:0.00pt;mso-wrap-distance-right:0.00pt;mso-wrap-distance-bottom:0.00pt;z-index:1;" stroked="false">
                 <v:imagedata r:id="rId24" o:title=""/>
                 <o:lock v:ext="edit" rotation="t"/>
               </v:shape>
@@ -18538,6 +18407,141 @@
           <w:szCs w:val="28"/>
           <w:highlight w:val="none"/>
           <w:lang w:val="en-US"/>
+        </w:rPr>
+      </w:r>
+    </w:p>
+    <w:p>
+      <w:pPr>
+        <w:pBdr/>
+        <w:spacing w:line="360" w:lineRule="auto"/>
+        <w:ind w:right="0" w:firstLine="709" w:left="0"/>
+        <w:rPr>
+          <w:b/>
+          <w:bCs/>
+          <w:sz w:val="28"/>
+          <w:szCs w:val="28"/>
+          <w:highlight w:val="none"/>
+          <w:lang w:val="en-CA"/>
+        </w:rPr>
+      </w:pPr>
+      <w:r>
+        <w:rPr>
+          <w:b/>
+          <w:bCs/>
+          <w:sz w:val="28"/>
+          <w:szCs w:val="28"/>
+          <w:highlight w:val="none"/>
+          <w:lang w:val="en-CA"/>
+        </w:rPr>
+      </w:r>
+      <w:r>
+        <w:rPr>
+          <w:b/>
+          <w:bCs/>
+          <w:sz w:val="28"/>
+          <w:szCs w:val="28"/>
+          <w:highlight w:val="none"/>
+          <w:lang w:val="en-CA"/>
+        </w:rPr>
+      </w:r>
+      <w:r>
+        <w:rPr>
+          <w:b/>
+          <w:bCs/>
+          <w:sz w:val="28"/>
+          <w:szCs w:val="28"/>
+          <w:highlight w:val="none"/>
+          <w:lang w:val="en-CA"/>
+        </w:rPr>
+      </w:r>
+    </w:p>
+    <w:p>
+      <w:pPr>
+        <w:pBdr/>
+        <w:spacing w:line="360" w:lineRule="auto"/>
+        <w:ind w:right="0" w:firstLine="709" w:left="0"/>
+        <w:rPr>
+          <w:b/>
+          <w:bCs/>
+          <w:sz w:val="28"/>
+          <w:szCs w:val="28"/>
+          <w:highlight w:val="none"/>
+          <w:lang w:val="en-CA"/>
+        </w:rPr>
+      </w:pPr>
+      <w:r>
+        <w:rPr>
+          <w:b/>
+          <w:bCs/>
+          <w:sz w:val="28"/>
+          <w:szCs w:val="28"/>
+          <w:highlight w:val="none"/>
+          <w:lang w:val="en-CA"/>
+        </w:rPr>
+      </w:r>
+      <w:r>
+        <w:rPr>
+          <w:b/>
+          <w:bCs/>
+          <w:sz w:val="28"/>
+          <w:szCs w:val="28"/>
+          <w:highlight w:val="none"/>
+          <w:lang w:val="en-CA"/>
+        </w:rPr>
+      </w:r>
+      <w:r>
+        <w:rPr>
+          <w:b/>
+          <w:bCs/>
+          <w:sz w:val="28"/>
+          <w:szCs w:val="28"/>
+          <w:highlight w:val="none"/>
+          <w:lang w:val="en-CA"/>
+        </w:rPr>
+      </w:r>
+    </w:p>
+    <w:p>
+      <w:pPr>
+        <w:pBdr/>
+        <w:spacing w:line="360" w:lineRule="auto"/>
+        <w:ind w:right="0" w:firstLine="709" w:left="0"/>
+        <w:rPr>
+          <w:b/>
+          <w:bCs/>
+          <w:sz w:val="28"/>
+          <w:szCs w:val="28"/>
+          <w:highlight w:val="none"/>
+          <w:lang w:val="en-CA"/>
+        </w:rPr>
+      </w:pPr>
+      <w:r>
+        <w:rPr>
+          <w:b/>
+          <w:bCs/>
+          <w:sz w:val="28"/>
+          <w:szCs w:val="28"/>
+          <w:highlight w:val="none"/>
+          <w:lang w:val="en-CA"/>
+        </w:rPr>
+      </w:r>
+      <w:r>
+        <w:rPr>
+          <w:b/>
+          <w:bCs/>
+          <w:sz w:val="28"/>
+          <w:szCs w:val="28"/>
+          <w:highlight w:val="none"/>
+          <w:lang w:val="en-CA"/>
+        </w:rPr>
+      </w:r>
+      <w:r>
+        <w:rPr>
+          <w:b/>
+          <w:bCs/>
+          <w:sz w:val="28"/>
+          <w:szCs w:val="28"/>
+          <w:highlight w:val="none"/>
+          <w:lang w:val="en-CA"/>
         </w:rPr>
       </w:r>
     </w:p>
@@ -19752,7 +19756,7 @@
     <w:p>
       <w:pPr>
         <w:pBdr/>
-        <w:spacing w:line="360" w:lineRule="auto"/>
+        <w:spacing w:before="240" w:line="360" w:lineRule="auto"/>
         <w:ind w:right="0" w:firstLine="709" w:left="0"/>
         <w:jc w:val="center"/>
         <w:rPr>
@@ -19771,8 +19775,8 @@
           <w:bCs/>
           <w:sz w:val="28"/>
           <w:szCs w:val="28"/>
-        </w:rPr>
-        <w:t xml:space="preserve">Задание </w:t>
+          <w:highlight w:val="none"/>
+        </w:rPr>
       </w:r>
       <w:r>
         <w:rPr>
@@ -19781,8 +19785,8 @@
           <w:bCs/>
           <w:sz w:val="28"/>
           <w:szCs w:val="28"/>
-        </w:rPr>
-        <w:t xml:space="preserve">№</w:t>
+          <w:highlight w:val="none"/>
+        </w:rPr>
       </w:r>
       <w:r>
         <w:rPr>
@@ -19791,10 +19795,16 @@
           <w:bCs/>
           <w:sz w:val="28"/>
           <w:szCs w:val="28"/>
-        </w:rPr>
-        <w:t xml:space="preserve">6</w:t>
-      </w:r>
-      <w:r>
+          <w:highlight w:val="none"/>
+        </w:rPr>
+      </w:r>
+    </w:p>
+    <w:p>
+      <w:pPr>
+        <w:pBdr/>
+        <w:spacing w:before="240" w:line="360" w:lineRule="auto"/>
+        <w:ind w:right="0" w:firstLine="709" w:left="0"/>
+        <w:jc w:val="center"/>
         <w:rPr>
           <w:rFonts w:ascii="Cambria" w:hAnsi="Cambria"/>
           <w:b/>
@@ -19803,7 +19813,7 @@
           <w:szCs w:val="28"/>
           <w:highlight w:val="none"/>
         </w:rPr>
-      </w:r>
+      </w:pPr>
       <w:r>
         <w:rPr>
           <w:rFonts w:ascii="Cambria" w:hAnsi="Cambria"/>
@@ -19811,6 +19821,46 @@
           <w:bCs/>
           <w:sz w:val="28"/>
           <w:szCs w:val="28"/>
+        </w:rPr>
+        <w:t xml:space="preserve">Задание </w:t>
+      </w:r>
+      <w:r>
+        <w:rPr>
+          <w:rFonts w:ascii="Cambria" w:hAnsi="Cambria"/>
+          <w:b/>
+          <w:bCs/>
+          <w:sz w:val="28"/>
+          <w:szCs w:val="28"/>
+        </w:rPr>
+        <w:t xml:space="preserve">№</w:t>
+      </w:r>
+      <w:r>
+        <w:rPr>
+          <w:rFonts w:ascii="Cambria" w:hAnsi="Cambria"/>
+          <w:b/>
+          <w:bCs/>
+          <w:sz w:val="28"/>
+          <w:szCs w:val="28"/>
+        </w:rPr>
+        <w:t xml:space="preserve">6</w:t>
+      </w:r>
+      <w:r>
+        <w:rPr>
+          <w:rFonts w:ascii="Cambria" w:hAnsi="Cambria"/>
+          <w:b/>
+          <w:bCs/>
+          <w:sz w:val="28"/>
+          <w:szCs w:val="28"/>
+          <w:highlight w:val="none"/>
+        </w:rPr>
+      </w:r>
+      <w:r>
+        <w:rPr>
+          <w:rFonts w:ascii="Cambria" w:hAnsi="Cambria"/>
+          <w:b/>
+          <w:bCs/>
+          <w:sz w:val="28"/>
+          <w:szCs w:val="28"/>
           <w:highlight w:val="none"/>
         </w:rPr>
       </w:r>
@@ -20001,6 +20051,501 @@
           <w:sz w:val="28"/>
           <w:szCs w:val="28"/>
           <w:lang w:val="en-US"/>
+        </w:rPr>
+      </w:pPr>
+      <w:r>
+        <w:rPr>
+          <w:b/>
+          <w:bCs/>
+          <w:sz w:val="28"/>
+          <w:szCs w:val="28"/>
+          <w:highlight w:val="none"/>
+          <w:lang w:val="en-CA"/>
+        </w:rPr>
+      </w:r>
+      <w:r>
+        <w:rPr>
+          <w:b/>
+          <w:bCs/>
+          <w:sz w:val="28"/>
+          <w:szCs w:val="28"/>
+          <w:highlight w:val="none"/>
+          <w:lang w:val="en-CA"/>
+        </w:rPr>
+      </w:r>
+      <w:r>
+        <w:rPr>
+          <w:b/>
+          <w:bCs/>
+          <w:sz w:val="28"/>
+          <w:szCs w:val="28"/>
+          <w:highlight w:val="none"/>
+          <w:lang w:val="en-CA"/>
+        </w:rPr>
+      </w:r>
+    </w:p>
+    <w:p>
+      <w:pPr>
+        <w:pBdr/>
+        <w:spacing w:line="360" w:lineRule="auto"/>
+        <w:ind w:right="0" w:firstLine="709" w:left="0"/>
+        <w:rPr>
+          <w:b/>
+          <w:bCs/>
+          <w:sz w:val="28"/>
+          <w:szCs w:val="28"/>
+          <w:highlight w:val="none"/>
+          <w:lang w:val="en-CA"/>
+        </w:rPr>
+      </w:pPr>
+      <w:r>
+        <w:rPr>
+          <w:b/>
+          <w:bCs/>
+          <w:sz w:val="28"/>
+          <w:szCs w:val="28"/>
+          <w:highlight w:val="none"/>
+          <w:lang w:val="en-CA"/>
+        </w:rPr>
+      </w:r>
+      <w:r>
+        <w:rPr>
+          <w:b/>
+          <w:bCs/>
+          <w:sz w:val="28"/>
+          <w:szCs w:val="28"/>
+          <w:highlight w:val="none"/>
+          <w:lang w:val="en-CA"/>
+        </w:rPr>
+      </w:r>
+      <w:r>
+        <w:rPr>
+          <w:b/>
+          <w:bCs/>
+          <w:sz w:val="28"/>
+          <w:szCs w:val="28"/>
+          <w:highlight w:val="none"/>
+          <w:lang w:val="en-CA"/>
+        </w:rPr>
+      </w:r>
+    </w:p>
+    <w:p>
+      <w:pPr>
+        <w:pBdr/>
+        <w:spacing w:line="360" w:lineRule="auto"/>
+        <w:ind w:right="0" w:firstLine="709" w:left="0"/>
+        <w:rPr>
+          <w:b/>
+          <w:bCs/>
+          <w:sz w:val="28"/>
+          <w:szCs w:val="28"/>
+          <w:highlight w:val="none"/>
+          <w:lang w:val="en-CA"/>
+        </w:rPr>
+      </w:pPr>
+      <w:r>
+        <w:rPr>
+          <w:b/>
+          <w:bCs/>
+          <w:sz w:val="28"/>
+          <w:szCs w:val="28"/>
+          <w:highlight w:val="none"/>
+          <w:lang w:val="en-CA"/>
+        </w:rPr>
+      </w:r>
+      <w:r>
+        <w:rPr>
+          <w:b/>
+          <w:bCs/>
+          <w:sz w:val="28"/>
+          <w:szCs w:val="28"/>
+          <w:highlight w:val="none"/>
+          <w:lang w:val="en-CA"/>
+        </w:rPr>
+      </w:r>
+      <w:r>
+        <w:rPr>
+          <w:b/>
+          <w:bCs/>
+          <w:sz w:val="28"/>
+          <w:szCs w:val="28"/>
+          <w:highlight w:val="none"/>
+          <w:lang w:val="en-CA"/>
+        </w:rPr>
+      </w:r>
+    </w:p>
+    <w:p>
+      <w:pPr>
+        <w:pBdr/>
+        <w:spacing w:line="360" w:lineRule="auto"/>
+        <w:ind w:right="0" w:firstLine="709" w:left="0"/>
+        <w:rPr>
+          <w:b/>
+          <w:bCs/>
+          <w:sz w:val="28"/>
+          <w:szCs w:val="28"/>
+          <w:highlight w:val="none"/>
+          <w:lang w:val="en-CA"/>
+        </w:rPr>
+      </w:pPr>
+      <w:r>
+        <w:rPr>
+          <w:b/>
+          <w:bCs/>
+          <w:sz w:val="28"/>
+          <w:szCs w:val="28"/>
+          <w:highlight w:val="none"/>
+          <w:lang w:val="en-CA"/>
+        </w:rPr>
+      </w:r>
+      <w:r>
+        <w:rPr>
+          <w:b/>
+          <w:bCs/>
+          <w:sz w:val="28"/>
+          <w:szCs w:val="28"/>
+          <w:highlight w:val="none"/>
+          <w:lang w:val="en-CA"/>
+        </w:rPr>
+      </w:r>
+      <w:r>
+        <w:rPr>
+          <w:b/>
+          <w:bCs/>
+          <w:sz w:val="28"/>
+          <w:szCs w:val="28"/>
+          <w:highlight w:val="none"/>
+          <w:lang w:val="en-CA"/>
+        </w:rPr>
+      </w:r>
+    </w:p>
+    <w:p>
+      <w:pPr>
+        <w:pBdr/>
+        <w:spacing w:line="360" w:lineRule="auto"/>
+        <w:ind w:right="0" w:firstLine="709" w:left="0"/>
+        <w:rPr>
+          <w:b/>
+          <w:bCs/>
+          <w:sz w:val="28"/>
+          <w:szCs w:val="28"/>
+          <w:highlight w:val="none"/>
+          <w:lang w:val="en-CA"/>
+        </w:rPr>
+      </w:pPr>
+      <w:r>
+        <w:rPr>
+          <w:b/>
+          <w:bCs/>
+          <w:sz w:val="28"/>
+          <w:szCs w:val="28"/>
+          <w:highlight w:val="none"/>
+          <w:lang w:val="en-CA"/>
+        </w:rPr>
+      </w:r>
+      <w:r>
+        <w:rPr>
+          <w:b/>
+          <w:bCs/>
+          <w:sz w:val="28"/>
+          <w:szCs w:val="28"/>
+          <w:highlight w:val="none"/>
+          <w:lang w:val="en-CA"/>
+        </w:rPr>
+      </w:r>
+      <w:r>
+        <w:rPr>
+          <w:b/>
+          <w:bCs/>
+          <w:sz w:val="28"/>
+          <w:szCs w:val="28"/>
+          <w:highlight w:val="none"/>
+          <w:lang w:val="en-CA"/>
+        </w:rPr>
+      </w:r>
+    </w:p>
+    <w:p>
+      <w:pPr>
+        <w:pBdr/>
+        <w:spacing w:line="360" w:lineRule="auto"/>
+        <w:ind w:right="0" w:firstLine="709" w:left="0"/>
+        <w:rPr>
+          <w:b/>
+          <w:bCs/>
+          <w:sz w:val="28"/>
+          <w:szCs w:val="28"/>
+          <w:highlight w:val="none"/>
+          <w:lang w:val="en-CA"/>
+        </w:rPr>
+      </w:pPr>
+      <w:r>
+        <w:rPr>
+          <w:b/>
+          <w:bCs/>
+          <w:sz w:val="28"/>
+          <w:szCs w:val="28"/>
+          <w:highlight w:val="none"/>
+          <w:lang w:val="en-CA"/>
+        </w:rPr>
+      </w:r>
+      <w:r>
+        <w:rPr>
+          <w:b/>
+          <w:bCs/>
+          <w:sz w:val="28"/>
+          <w:szCs w:val="28"/>
+          <w:highlight w:val="none"/>
+          <w:lang w:val="en-CA"/>
+        </w:rPr>
+      </w:r>
+      <w:r>
+        <w:rPr>
+          <w:b/>
+          <w:bCs/>
+          <w:sz w:val="28"/>
+          <w:szCs w:val="28"/>
+          <w:highlight w:val="none"/>
+          <w:lang w:val="en-CA"/>
+        </w:rPr>
+      </w:r>
+    </w:p>
+    <w:p>
+      <w:pPr>
+        <w:pBdr/>
+        <w:spacing w:line="360" w:lineRule="auto"/>
+        <w:ind w:right="0" w:firstLine="709" w:left="0"/>
+        <w:rPr>
+          <w:b/>
+          <w:bCs/>
+          <w:sz w:val="28"/>
+          <w:szCs w:val="28"/>
+          <w:highlight w:val="none"/>
+          <w:lang w:val="en-CA"/>
+        </w:rPr>
+      </w:pPr>
+      <w:r>
+        <w:rPr>
+          <w:b/>
+          <w:bCs/>
+          <w:sz w:val="28"/>
+          <w:szCs w:val="28"/>
+          <w:highlight w:val="none"/>
+          <w:lang w:val="en-CA"/>
+        </w:rPr>
+      </w:r>
+      <w:r>
+        <w:rPr>
+          <w:b/>
+          <w:bCs/>
+          <w:sz w:val="28"/>
+          <w:szCs w:val="28"/>
+          <w:highlight w:val="none"/>
+          <w:lang w:val="en-CA"/>
+        </w:rPr>
+      </w:r>
+      <w:r>
+        <w:rPr>
+          <w:b/>
+          <w:bCs/>
+          <w:sz w:val="28"/>
+          <w:szCs w:val="28"/>
+          <w:highlight w:val="none"/>
+          <w:lang w:val="en-CA"/>
+        </w:rPr>
+      </w:r>
+    </w:p>
+    <w:p>
+      <w:pPr>
+        <w:pBdr/>
+        <w:spacing w:line="360" w:lineRule="auto"/>
+        <w:ind w:right="0" w:firstLine="709" w:left="0"/>
+        <w:rPr>
+          <w:b/>
+          <w:bCs/>
+          <w:sz w:val="28"/>
+          <w:szCs w:val="28"/>
+          <w:highlight w:val="none"/>
+          <w:lang w:val="en-CA"/>
+        </w:rPr>
+      </w:pPr>
+      <w:r>
+        <w:rPr>
+          <w:b/>
+          <w:bCs/>
+          <w:sz w:val="28"/>
+          <w:szCs w:val="28"/>
+          <w:highlight w:val="none"/>
+          <w:lang w:val="en-CA"/>
+        </w:rPr>
+      </w:r>
+      <w:r>
+        <w:rPr>
+          <w:b/>
+          <w:bCs/>
+          <w:sz w:val="28"/>
+          <w:szCs w:val="28"/>
+          <w:highlight w:val="none"/>
+          <w:lang w:val="en-CA"/>
+        </w:rPr>
+      </w:r>
+      <w:r>
+        <w:rPr>
+          <w:b/>
+          <w:bCs/>
+          <w:sz w:val="28"/>
+          <w:szCs w:val="28"/>
+          <w:highlight w:val="none"/>
+          <w:lang w:val="en-CA"/>
+        </w:rPr>
+      </w:r>
+    </w:p>
+    <w:p>
+      <w:pPr>
+        <w:pBdr/>
+        <w:spacing w:line="360" w:lineRule="auto"/>
+        <w:ind w:right="0" w:firstLine="709" w:left="0"/>
+        <w:rPr>
+          <w:b/>
+          <w:bCs/>
+          <w:sz w:val="28"/>
+          <w:szCs w:val="28"/>
+          <w:highlight w:val="none"/>
+          <w:lang w:val="en-CA"/>
+        </w:rPr>
+      </w:pPr>
+      <w:r>
+        <w:rPr>
+          <w:b/>
+          <w:bCs/>
+          <w:sz w:val="28"/>
+          <w:szCs w:val="28"/>
+          <w:highlight w:val="none"/>
+          <w:lang w:val="en-CA"/>
+        </w:rPr>
+      </w:r>
+      <w:r>
+        <w:rPr>
+          <w:b/>
+          <w:bCs/>
+          <w:sz w:val="28"/>
+          <w:szCs w:val="28"/>
+          <w:highlight w:val="none"/>
+          <w:lang w:val="en-CA"/>
+        </w:rPr>
+      </w:r>
+      <w:r>
+        <w:rPr>
+          <w:b/>
+          <w:bCs/>
+          <w:sz w:val="28"/>
+          <w:szCs w:val="28"/>
+          <w:highlight w:val="none"/>
+          <w:lang w:val="en-CA"/>
+        </w:rPr>
+      </w:r>
+    </w:p>
+    <w:p>
+      <w:pPr>
+        <w:pBdr/>
+        <w:spacing w:line="360" w:lineRule="auto"/>
+        <w:ind w:right="0" w:firstLine="709" w:left="0"/>
+        <w:rPr>
+          <w:b/>
+          <w:bCs/>
+          <w:sz w:val="28"/>
+          <w:szCs w:val="28"/>
+          <w:highlight w:val="none"/>
+          <w:lang w:val="en-CA"/>
+        </w:rPr>
+      </w:pPr>
+      <w:r>
+        <w:rPr>
+          <w:b/>
+          <w:bCs/>
+          <w:sz w:val="28"/>
+          <w:szCs w:val="28"/>
+          <w:highlight w:val="none"/>
+          <w:lang w:val="en-CA"/>
+        </w:rPr>
+      </w:r>
+      <w:r>
+        <w:rPr>
+          <w:b/>
+          <w:bCs/>
+          <w:sz w:val="28"/>
+          <w:szCs w:val="28"/>
+          <w:highlight w:val="none"/>
+          <w:lang w:val="en-CA"/>
+        </w:rPr>
+      </w:r>
+      <w:r>
+        <w:rPr>
+          <w:b/>
+          <w:bCs/>
+          <w:sz w:val="28"/>
+          <w:szCs w:val="28"/>
+          <w:highlight w:val="none"/>
+          <w:lang w:val="en-CA"/>
+        </w:rPr>
+      </w:r>
+    </w:p>
+    <w:p>
+      <w:pPr>
+        <w:pBdr/>
+        <w:spacing w:line="360" w:lineRule="auto"/>
+        <w:ind w:right="0" w:firstLine="709" w:left="0"/>
+        <w:rPr>
+          <w:b/>
+          <w:bCs/>
+          <w:sz w:val="28"/>
+          <w:szCs w:val="28"/>
+          <w:highlight w:val="none"/>
+          <w:lang w:val="en-CA"/>
+        </w:rPr>
+      </w:pPr>
+      <w:r>
+        <w:rPr>
+          <w:b/>
+          <w:bCs/>
+          <w:sz w:val="28"/>
+          <w:szCs w:val="28"/>
+          <w:highlight w:val="none"/>
+          <w:lang w:val="en-CA"/>
+        </w:rPr>
+      </w:r>
+      <w:r>
+        <w:rPr>
+          <w:b/>
+          <w:bCs/>
+          <w:sz w:val="28"/>
+          <w:szCs w:val="28"/>
+          <w:highlight w:val="none"/>
+          <w:lang w:val="en-CA"/>
+        </w:rPr>
+      </w:r>
+      <w:r>
+        <w:rPr>
+          <w:b/>
+          <w:bCs/>
+          <w:sz w:val="28"/>
+          <w:szCs w:val="28"/>
+          <w:highlight w:val="none"/>
+          <w:lang w:val="en-CA"/>
+        </w:rPr>
+      </w:r>
+    </w:p>
+    <w:p>
+      <w:pPr>
+        <w:pBdr/>
+        <w:spacing w:line="360" w:lineRule="auto"/>
+        <w:ind w:right="0" w:firstLine="709" w:left="0"/>
+        <w:rPr>
+          <w:b/>
+          <w:bCs/>
+          <w:sz w:val="28"/>
+          <w:szCs w:val="28"/>
+          <w:highlight w:val="none"/>
+          <w:lang w:val="en-CA"/>
         </w:rPr>
       </w:pPr>
       <w:r>
@@ -20074,7 +20619,7 @@
           <mc:Choice Requires="wpg">
             <w:drawing>
               <wp:inline xmlns:wp="http://schemas.openxmlformats.org/drawingml/2006/wordprocessingDrawing" distT="0" distB="0" distL="0" distR="0">
-                <wp:extent cx="4328744" cy="6165180"/>
+                <wp:extent cx="3254400" cy="4635054"/>
                 <wp:effectExtent l="0" t="0" r="0" b="0"/>
                 <wp:docPr id="14" name=""/>
                 <wp:cNvGraphicFramePr>
@@ -20097,7 +20642,7 @@
                       <pic:spPr bwMode="auto">
                         <a:xfrm flipH="0" flipV="0">
                           <a:off x="0" y="0"/>
-                          <a:ext cx="4328743" cy="6165180"/>
+                          <a:ext cx="3254399" cy="4635053"/>
                         </a:xfrm>
                         <a:prstGeom prst="rect">
                           <a:avLst/>
@@ -20130,7 +20675,7 @@
                 <v:path o:extrusionok="f" gradientshapeok="t" o:connecttype="rect"/>
                 <o:lock v:ext="edit" aspectratio="t"/>
               </v:shapetype>
-              <v:shape id="_x0000_i13" o:spid="_x0000_s13" type="#_x0000_t75" style="width:340.85pt;height:485.45pt;mso-wrap-distance-left:0.00pt;mso-wrap-distance-top:0.00pt;mso-wrap-distance-right:0.00pt;mso-wrap-distance-bottom:0.00pt;z-index:1;" stroked="false">
+              <v:shape id="_x0000_i13" o:spid="_x0000_s13" type="#_x0000_t75" style="width:256.25pt;height:364.96pt;mso-wrap-distance-left:0.00pt;mso-wrap-distance-top:0.00pt;mso-wrap-distance-right:0.00pt;mso-wrap-distance-bottom:0.00pt;z-index:1;" stroked="false">
                 <v:imagedata r:id="rId25" o:title=""/>
                 <o:lock v:ext="edit" rotation="t"/>
               </v:shape>

</xml_diff>